<commit_message>
Update ZA Bank guide, add images and docs
Add two asset images and update the ZA Bank onboarding guide: revise cashback amounts and eligibility (referral changed to 550HKD at top; detailed cashback criteria updated to 350HKD/550HKD flow and extra 200HKD for stock holding), add recommended steps for meeting requirements, adjust other activity rewards, and replace an embedded image link. Also update corresponding DOCX and PDF binary files.
</commit_message>
<xml_diff>
--- a/盈立复星众安平安开户指南.docx
+++ b/盈立复星众安平安开户指南.docx
@@ -5,7 +5,7 @@
     <w:p>
       <w:pPr>
         <w:rPr>
-          <w:rFonts w:hint="default" w:ascii="宋体" w:hAnsi="宋体" w:eastAsia="宋体" w:cs="宋体"/>
+          <w:rFonts w:hint="eastAsia" w:ascii="宋体" w:hAnsi="宋体" w:eastAsia="宋体" w:cs="宋体"/>
           <w:sz w:val="24"/>
           <w:szCs w:val="24"/>
           <w:lang w:val="en-US" w:eastAsia="zh-CN"/>
@@ -79,16 +79,6 @@
     </w:p>
     <w:p>
       <w:pPr>
-        <w:rPr>
-          <w:rFonts w:hint="eastAsia"/>
-          <w:sz w:val="48"/>
-          <w:szCs w:val="48"/>
-          <w:lang w:val="en-US" w:eastAsia="zh-CN"/>
-        </w:rPr>
-      </w:pPr>
-    </w:p>
-    <w:p>
-      <w:pPr>
         <w:pStyle w:val="2"/>
         <w:bidi w:val="0"/>
         <w:jc w:val="center"/>
@@ -156,6 +146,26 @@
       <w:pPr>
         <w:rPr>
           <w:rFonts w:hint="default"/>
+          <w:sz w:val="30"/>
+          <w:szCs w:val="30"/>
+          <w:lang w:val="en-US" w:eastAsia="zh-CN"/>
+        </w:rPr>
+      </w:pPr>
+      <w:r>
+        <w:rPr>
+          <w:rFonts w:hint="eastAsia"/>
+          <w:color w:val="FF0000"/>
+          <w:sz w:val="30"/>
+          <w:szCs w:val="30"/>
+          <w:lang w:val="en-US" w:eastAsia="zh-CN"/>
+        </w:rPr>
+        <w:t>注意！在入金前请先检查是否填写邀请码否则浪费活动了！</w:t>
+      </w:r>
+    </w:p>
+    <w:p>
+      <w:pPr>
+        <w:rPr>
+          <w:rFonts w:hint="eastAsia"/>
           <w:sz w:val="30"/>
           <w:szCs w:val="30"/>
           <w:lang w:val="en-US" w:eastAsia="zh-CN"/>
@@ -206,8 +216,6 @@
         </w:rPr>
         <w:t>提前下载 ZA Bank</w:t>
       </w:r>
-      <w:bookmarkStart w:id="0" w:name="_GoBack"/>
-      <w:bookmarkEnd w:id="0"/>
     </w:p>
     <w:p>
       <w:pPr>
@@ -1355,6 +1363,323 @@
     </w:p>
     <w:p>
       <w:pPr>
+        <w:rPr>
+          <w:rFonts w:hint="eastAsia"/>
+          <w:sz w:val="28"/>
+          <w:szCs w:val="28"/>
+          <w:lang w:val="en-US" w:eastAsia="zh-CN"/>
+        </w:rPr>
+      </w:pPr>
+      <w:r>
+        <w:rPr>
+          <w:rFonts w:hint="eastAsia"/>
+          <w:sz w:val="28"/>
+          <w:szCs w:val="28"/>
+          <w:lang w:val="en-US" w:eastAsia="zh-CN"/>
+        </w:rPr>
+        <w:t>填邀请码注册活动更新：</w:t>
+      </w:r>
+    </w:p>
+    <w:p>
+      <w:pPr>
+        <w:rPr>
+          <w:rFonts w:hint="eastAsia"/>
+          <w:color w:val="FF0000"/>
+          <w:sz w:val="28"/>
+          <w:szCs w:val="28"/>
+          <w:lang w:val="en-US" w:eastAsia="zh-CN"/>
+        </w:rPr>
+      </w:pPr>
+      <w:r>
+        <w:rPr>
+          <w:rFonts w:hint="eastAsia"/>
+          <w:color w:val="FF0000"/>
+          <w:sz w:val="28"/>
+          <w:szCs w:val="28"/>
+          <w:lang w:val="en-US" w:eastAsia="zh-CN"/>
+        </w:rPr>
+        <w:t>开户14天内，持有≥1,000HKD等值总结余（存款、股票、基金，这三样需要同时持有过夜），可以返</w:t>
+      </w:r>
+      <w:r>
+        <w:rPr>
+          <w:rFonts w:hint="eastAsia"/>
+          <w:color w:val="FF0000"/>
+          <w:sz w:val="28"/>
+          <w:szCs w:val="28"/>
+          <w:lang w:val="en-US" w:eastAsia="zh-CN"/>
+        </w:rPr>
+        <w:t>300HKD。</w:t>
+      </w:r>
+    </w:p>
+    <w:p>
+      <w:pPr>
+        <w:jc w:val="both"/>
+        <w:rPr>
+          <w:rFonts w:hint="eastAsia"/>
+          <w:color w:val="FF0000"/>
+          <w:sz w:val="28"/>
+          <w:szCs w:val="28"/>
+          <w:lang w:val="en-US" w:eastAsia="zh-CN"/>
+        </w:rPr>
+      </w:pPr>
+      <w:r>
+        <w:rPr>
+          <w:rFonts w:hint="eastAsia"/>
+          <w:color w:val="FF0000"/>
+          <w:sz w:val="28"/>
+          <w:szCs w:val="28"/>
+          <w:lang w:val="en-US" w:eastAsia="zh-CN"/>
+        </w:rPr>
+        <w:t>累计持有≥10,000HKD等值股票市值14天（无需连续）可额外返200HKD</w:t>
+      </w:r>
+    </w:p>
+    <w:p>
+      <w:pPr>
+        <w:jc w:val="both"/>
+        <w:rPr>
+          <w:rFonts w:hint="default"/>
+          <w:color w:val="000000" w:themeColor="text1"/>
+          <w:sz w:val="28"/>
+          <w:szCs w:val="28"/>
+          <w:lang w:val="en-US" w:eastAsia="zh-CN"/>
+          <w14:textFill>
+            <w14:solidFill>
+              <w14:schemeClr w14:val="tx1"/>
+            </w14:solidFill>
+          </w14:textFill>
+        </w:rPr>
+      </w:pPr>
+      <w:r>
+        <w:rPr>
+          <w:rFonts w:hint="eastAsia"/>
+          <w:color w:val="000000" w:themeColor="text1"/>
+          <w:sz w:val="28"/>
+          <w:szCs w:val="28"/>
+          <w:lang w:val="en-US" w:eastAsia="zh-CN"/>
+          <w14:textFill>
+            <w14:solidFill>
+              <w14:schemeClr w14:val="tx1"/>
+            </w14:solidFill>
+          </w14:textFill>
+        </w:rPr>
+        <w:t>除此之外，维持7天股票市值≥10,000HKD，您可以领取30刀等值镁光股票(MU)。购买股票的同时可以用股票优惠卷。</w:t>
+      </w:r>
+    </w:p>
+    <w:p>
+      <w:pPr>
+        <w:jc w:val="both"/>
+        <w:rPr>
+          <w:rFonts w:hint="eastAsia"/>
+          <w:color w:val="000000" w:themeColor="text1"/>
+          <w:sz w:val="28"/>
+          <w:szCs w:val="28"/>
+          <w:lang w:val="en-US" w:eastAsia="zh-CN"/>
+          <w14:textFill>
+            <w14:solidFill>
+              <w14:schemeClr w14:val="tx1"/>
+            </w14:solidFill>
+          </w14:textFill>
+        </w:rPr>
+      </w:pPr>
+    </w:p>
+    <w:p>
+      <w:pPr>
+        <w:jc w:val="both"/>
+        <w:rPr>
+          <w:rFonts w:hint="eastAsia"/>
+          <w:color w:val="000000" w:themeColor="text1"/>
+          <w:sz w:val="28"/>
+          <w:szCs w:val="28"/>
+          <w:lang w:val="en-US" w:eastAsia="zh-CN"/>
+          <w14:textFill>
+            <w14:solidFill>
+              <w14:schemeClr w14:val="tx1"/>
+            </w14:solidFill>
+          </w14:textFill>
+        </w:rPr>
+      </w:pPr>
+      <w:r>
+        <w:rPr>
+          <w:rFonts w:hint="eastAsia"/>
+          <w:color w:val="000000" w:themeColor="text1"/>
+          <w:sz w:val="28"/>
+          <w:szCs w:val="28"/>
+          <w:lang w:val="en-US" w:eastAsia="zh-CN"/>
+          <w14:textFill>
+            <w14:solidFill>
+              <w14:schemeClr w14:val="tx1"/>
+            </w14:solidFill>
+          </w14:textFill>
+        </w:rPr>
+        <w:t>推荐操作步骤：</w:t>
+      </w:r>
+    </w:p>
+    <w:p>
+      <w:pPr>
+        <w:jc w:val="both"/>
+        <w:rPr>
+          <w:rFonts w:hint="eastAsia"/>
+          <w:color w:val="000000" w:themeColor="text1"/>
+          <w:sz w:val="28"/>
+          <w:szCs w:val="28"/>
+          <w:lang w:val="en-US" w:eastAsia="zh-CN"/>
+          <w14:textFill>
+            <w14:solidFill>
+              <w14:schemeClr w14:val="tx1"/>
+            </w14:solidFill>
+          </w14:textFill>
+        </w:rPr>
+      </w:pPr>
+      <w:r>
+        <w:rPr>
+          <w:rFonts w:hint="eastAsia"/>
+          <w:color w:val="000000" w:themeColor="text1"/>
+          <w:sz w:val="28"/>
+          <w:szCs w:val="28"/>
+          <w:lang w:val="en-US" w:eastAsia="zh-CN"/>
+          <w14:textFill>
+            <w14:solidFill>
+              <w14:schemeClr w14:val="tx1"/>
+            </w14:solidFill>
+          </w14:textFill>
+        </w:rPr>
+        <w:t>1、存入10400HKD，买9股A博时港元（HK.03152）花费10196，可以使用返100HKD的优惠券。</w:t>
+      </w:r>
+    </w:p>
+    <w:p>
+      <w:pPr>
+        <w:jc w:val="both"/>
+        <w:rPr>
+          <w:rFonts w:hint="eastAsia"/>
+          <w:color w:val="000000" w:themeColor="text1"/>
+          <w:sz w:val="28"/>
+          <w:szCs w:val="28"/>
+          <w:lang w:val="en-US" w:eastAsia="zh-CN"/>
+          <w14:textFill>
+            <w14:solidFill>
+              <w14:schemeClr w14:val="tx1"/>
+            </w14:solidFill>
+          </w14:textFill>
+        </w:rPr>
+      </w:pPr>
+      <w:r>
+        <w:rPr>
+          <w:rFonts w:hint="eastAsia"/>
+          <w:color w:val="000000" w:themeColor="text1"/>
+          <w:sz w:val="28"/>
+          <w:szCs w:val="28"/>
+          <w:lang w:val="en-US" w:eastAsia="zh-CN"/>
+          <w14:textFill>
+            <w14:solidFill>
+              <w14:schemeClr w14:val="tx1"/>
+            </w14:solidFill>
+          </w14:textFill>
+        </w:rPr>
+        <w:t>2、买入100HKD的货币基金（基金买入卖出0手续费）。</w:t>
+      </w:r>
+    </w:p>
+    <w:p>
+      <w:pPr>
+        <w:jc w:val="both"/>
+        <w:rPr>
+          <w:rFonts w:hint="eastAsia"/>
+          <w:color w:val="000000" w:themeColor="text1"/>
+          <w:sz w:val="28"/>
+          <w:szCs w:val="28"/>
+          <w:lang w:val="en-US" w:eastAsia="zh-CN"/>
+          <w14:textFill>
+            <w14:solidFill>
+              <w14:schemeClr w14:val="tx1"/>
+            </w14:solidFill>
+          </w14:textFill>
+        </w:rPr>
+      </w:pPr>
+      <w:r>
+        <w:rPr>
+          <w:rFonts w:hint="eastAsia"/>
+          <w:color w:val="000000" w:themeColor="text1"/>
+          <w:sz w:val="28"/>
+          <w:szCs w:val="28"/>
+          <w:lang w:val="en-US" w:eastAsia="zh-CN"/>
+          <w14:textFill>
+            <w14:solidFill>
+              <w14:schemeClr w14:val="tx1"/>
+            </w14:solidFill>
+          </w14:textFill>
+        </w:rPr>
+        <w:t>3、剩余100HKD左右的现金存款，持有过夜即可。然后持有14天博时港元即可。</w:t>
+      </w:r>
+    </w:p>
+    <w:p>
+      <w:pPr>
+        <w:jc w:val="both"/>
+        <w:rPr>
+          <w:rFonts w:hint="default"/>
+          <w:color w:val="000000" w:themeColor="text1"/>
+          <w:sz w:val="28"/>
+          <w:szCs w:val="28"/>
+          <w:lang w:val="en-US" w:eastAsia="zh-CN"/>
+          <w14:textFill>
+            <w14:solidFill>
+              <w14:schemeClr w14:val="tx1"/>
+            </w14:solidFill>
+          </w14:textFill>
+        </w:rPr>
+      </w:pPr>
+      <w:r>
+        <w:rPr>
+          <w:rFonts w:hint="default"/>
+          <w:color w:val="000000" w:themeColor="text1"/>
+          <w:sz w:val="28"/>
+          <w:szCs w:val="28"/>
+          <w:lang w:val="en-US" w:eastAsia="zh-CN"/>
+          <w14:textFill>
+            <w14:solidFill>
+              <w14:schemeClr w14:val="tx1"/>
+            </w14:solidFill>
+          </w14:textFill>
+        </w:rPr>
+        <w:drawing>
+          <wp:inline distT="0" distB="0" distL="114300" distR="114300">
+            <wp:extent cx="2588260" cy="3695065"/>
+            <wp:effectExtent l="0" t="0" r="2540" b="635"/>
+            <wp:docPr id="3" name="图片 3" descr="za-stock-boshi"/>
+            <wp:cNvGraphicFramePr>
+              <a:graphicFrameLocks xmlns:a="http://schemas.openxmlformats.org/drawingml/2006/main" noChangeAspect="1"/>
+            </wp:cNvGraphicFramePr>
+            <a:graphic xmlns:a="http://schemas.openxmlformats.org/drawingml/2006/main">
+              <a:graphicData uri="http://schemas.openxmlformats.org/drawingml/2006/picture">
+                <pic:pic xmlns:pic="http://schemas.openxmlformats.org/drawingml/2006/picture">
+                  <pic:nvPicPr>
+                    <pic:cNvPr id="3" name="图片 3" descr="za-stock-boshi"/>
+                    <pic:cNvPicPr>
+                      <a:picLocks noChangeAspect="1"/>
+                    </pic:cNvPicPr>
+                  </pic:nvPicPr>
+                  <pic:blipFill>
+                    <a:blip r:embed="rId4"/>
+                    <a:stretch>
+                      <a:fillRect/>
+                    </a:stretch>
+                  </pic:blipFill>
+                  <pic:spPr>
+                    <a:xfrm>
+                      <a:off x="0" y="0"/>
+                      <a:ext cx="2588260" cy="3695065"/>
+                    </a:xfrm>
+                    <a:prstGeom prst="rect">
+                      <a:avLst/>
+                    </a:prstGeom>
+                  </pic:spPr>
+                </pic:pic>
+              </a:graphicData>
+            </a:graphic>
+          </wp:inline>
+        </w:drawing>
+      </w:r>
+    </w:p>
+    <w:p>
+      <w:pPr>
         <w:pStyle w:val="7"/>
         <w:keepNext w:val="0"/>
         <w:keepLines w:val="0"/>
@@ -1364,7 +1689,7 @@
         <w:ind w:left="0" w:firstLine="0"/>
         <w:jc w:val="left"/>
         <w:rPr>
-          <w:rFonts w:hint="default" w:ascii="Segoe UI" w:hAnsi="Segoe UI" w:eastAsia="Segoe UI" w:cs="Segoe UI"/>
+          <w:rFonts w:ascii="Segoe UI" w:hAnsi="Segoe UI" w:eastAsia="Segoe UI" w:cs="Segoe UI"/>
           <w:i w:val="0"/>
           <w:iCs w:val="0"/>
           <w:caps w:val="0"/>
@@ -1386,7 +1711,65 @@
           <w:szCs w:val="28"/>
           <w:shd w:val="clear" w:fill="FFFFFF"/>
         </w:rPr>
-        <w:t>存款： 日终存款余额≥HKD 200,000 或其等值; 或</w:t>
+        <w:t>返现机制： 达成以上任一条件后:，系统将在次日晚上 21:00 前处理。核对无误后，我将直接通过 ZA Bank 转账300 HKD，或按</w:t>
+      </w:r>
+      <w:r>
+        <w:rPr>
+          <w:rFonts w:hint="eastAsia" w:ascii="Segoe UI" w:hAnsi="Segoe UI" w:eastAsia="宋体" w:cs="Segoe UI"/>
+          <w:i w:val="0"/>
+          <w:iCs w:val="0"/>
+          <w:caps w:val="0"/>
+          <w:color w:val="000000"/>
+          <w:spacing w:val="0"/>
+          <w:sz w:val="28"/>
+          <w:szCs w:val="28"/>
+          <w:shd w:val="clear" w:fill="FFFFFF"/>
+          <w:lang w:val="en-US" w:eastAsia="zh-CN"/>
+        </w:rPr>
+        <w:t>ZA Bank</w:t>
+      </w:r>
+      <w:r>
+        <w:rPr>
+          <w:rFonts w:hint="default" w:ascii="Segoe UI" w:hAnsi="Segoe UI" w:eastAsia="Segoe UI" w:cs="Segoe UI"/>
+          <w:i w:val="0"/>
+          <w:iCs w:val="0"/>
+          <w:caps w:val="0"/>
+          <w:color w:val="000000"/>
+          <w:spacing w:val="0"/>
+          <w:sz w:val="28"/>
+          <w:szCs w:val="28"/>
+          <w:shd w:val="clear" w:fill="FFFFFF"/>
+        </w:rPr>
+        <w:t>实时汇率通过微信/支付宝返还你</w:t>
+      </w:r>
+      <w:r>
+        <w:rPr>
+          <w:rFonts w:hint="eastAsia" w:ascii="Segoe UI" w:hAnsi="Segoe UI" w:eastAsia="宋体" w:cs="Segoe UI"/>
+          <w:i w:val="0"/>
+          <w:iCs w:val="0"/>
+          <w:caps w:val="0"/>
+          <w:color w:val="000000"/>
+          <w:spacing w:val="0"/>
+          <w:sz w:val="28"/>
+          <w:szCs w:val="28"/>
+          <w:shd w:val="clear" w:fill="FFFFFF"/>
+          <w:lang w:val="en-US" w:eastAsia="zh-CN"/>
+        </w:rPr>
+        <w:t>等值RMB</w:t>
+      </w:r>
+      <w:r>
+        <w:rPr>
+          <w:rFonts w:hint="default" w:ascii="Segoe UI" w:hAnsi="Segoe UI" w:eastAsia="Segoe UI" w:cs="Segoe UI"/>
+          <w:i w:val="0"/>
+          <w:iCs w:val="0"/>
+          <w:caps w:val="0"/>
+          <w:color w:val="000000"/>
+          <w:spacing w:val="0"/>
+          <w:sz w:val="28"/>
+          <w:szCs w:val="28"/>
+          <w:shd w:val="clear" w:fill="FFFFFF"/>
+        </w:rPr>
+        <w:t xml:space="preserve">  </w:t>
       </w:r>
     </w:p>
     <w:p>
@@ -1400,7 +1783,7 @@
         <w:ind w:left="0" w:firstLine="0"/>
         <w:jc w:val="left"/>
         <w:rPr>
-          <w:rFonts w:hint="default" w:ascii="Segoe UI" w:hAnsi="Segoe UI" w:eastAsia="Segoe UI" w:cs="Segoe UI"/>
+          <w:rFonts w:hint="default" w:ascii="Segoe UI" w:hAnsi="Segoe UI" w:eastAsia="宋体" w:cs="Segoe UI"/>
           <w:i w:val="0"/>
           <w:iCs w:val="0"/>
           <w:caps w:val="0"/>
@@ -1408,6 +1791,7 @@
           <w:spacing w:val="0"/>
           <w:sz w:val="28"/>
           <w:szCs w:val="28"/>
+          <w:lang w:val="en-US" w:eastAsia="zh-CN"/>
         </w:rPr>
       </w:pPr>
       <w:r>
@@ -1422,7 +1806,95 @@
           <w:szCs w:val="28"/>
           <w:shd w:val="clear" w:fill="FFFFFF"/>
         </w:rPr>
-        <w:t>基金： 日终基金总资产≥HKD 100,000 或其等值; 或</w:t>
+        <w:t>另外，被邀请人维持此条件累计达 7 天(无需连续): 日终股票总资产≥HKD10</w:t>
+      </w:r>
+      <w:r>
+        <w:rPr>
+          <w:rFonts w:hint="eastAsia" w:ascii="Segoe UI" w:hAnsi="Segoe UI" w:eastAsia="宋体" w:cs="Segoe UI"/>
+          <w:i w:val="0"/>
+          <w:iCs w:val="0"/>
+          <w:caps w:val="0"/>
+          <w:color w:val="000000"/>
+          <w:spacing w:val="0"/>
+          <w:sz w:val="28"/>
+          <w:szCs w:val="28"/>
+          <w:shd w:val="clear" w:fill="FFFFFF"/>
+          <w:lang w:val="en-US" w:eastAsia="zh-CN"/>
+        </w:rPr>
+        <w:t>,</w:t>
+      </w:r>
+      <w:r>
+        <w:rPr>
+          <w:rFonts w:hint="default" w:ascii="Segoe UI" w:hAnsi="Segoe UI" w:eastAsia="Segoe UI" w:cs="Segoe UI"/>
+          <w:i w:val="0"/>
+          <w:iCs w:val="0"/>
+          <w:caps w:val="0"/>
+          <w:color w:val="000000"/>
+          <w:spacing w:val="0"/>
+          <w:sz w:val="28"/>
+          <w:szCs w:val="28"/>
+          <w:shd w:val="clear" w:fill="FFFFFF"/>
+        </w:rPr>
+        <w:t>000 或其等值; 或日终基金总资产 HKD100</w:t>
+      </w:r>
+      <w:r>
+        <w:rPr>
+          <w:rFonts w:hint="eastAsia" w:ascii="Segoe UI" w:hAnsi="Segoe UI" w:eastAsia="宋体" w:cs="Segoe UI"/>
+          <w:i w:val="0"/>
+          <w:iCs w:val="0"/>
+          <w:caps w:val="0"/>
+          <w:color w:val="000000"/>
+          <w:spacing w:val="0"/>
+          <w:sz w:val="28"/>
+          <w:szCs w:val="28"/>
+          <w:shd w:val="clear" w:fill="FFFFFF"/>
+          <w:lang w:val="en-US" w:eastAsia="zh-CN"/>
+        </w:rPr>
+        <w:t>,</w:t>
+      </w:r>
+      <w:r>
+        <w:rPr>
+          <w:rFonts w:hint="default" w:ascii="Segoe UI" w:hAnsi="Segoe UI" w:eastAsia="Segoe UI" w:cs="Segoe UI"/>
+          <w:i w:val="0"/>
+          <w:iCs w:val="0"/>
+          <w:caps w:val="0"/>
+          <w:color w:val="000000"/>
+          <w:spacing w:val="0"/>
+          <w:sz w:val="28"/>
+          <w:szCs w:val="28"/>
+          <w:shd w:val="clear" w:fill="FFFFFF"/>
+        </w:rPr>
+        <w:t>000 或其等值;或日终存款余额≥HKD200,000 或其等值（只需满足其中一个条件）即可前往 ZA Quest7 领取 1 张 USD30 美光科技(MU) 指定美股兑换券</w:t>
+      </w:r>
+      <w:r>
+        <w:rPr>
+          <w:rFonts w:hint="eastAsia" w:ascii="Segoe UI" w:hAnsi="Segoe UI" w:eastAsia="宋体" w:cs="Segoe UI"/>
+          <w:i w:val="0"/>
+          <w:iCs w:val="0"/>
+          <w:caps w:val="0"/>
+          <w:color w:val="000000"/>
+          <w:spacing w:val="0"/>
+          <w:sz w:val="28"/>
+          <w:szCs w:val="28"/>
+          <w:shd w:val="clear" w:fill="FFFFFF"/>
+          <w:lang w:eastAsia="zh-CN"/>
+        </w:rPr>
+        <w:t>。</w:t>
+      </w:r>
+      <w:r>
+        <w:rPr>
+          <w:rFonts w:hint="eastAsia" w:ascii="Segoe UI" w:hAnsi="Segoe UI" w:eastAsia="宋体" w:cs="Segoe UI"/>
+          <w:i w:val="0"/>
+          <w:iCs w:val="0"/>
+          <w:caps w:val="0"/>
+          <w:color w:val="000000"/>
+          <w:spacing w:val="0"/>
+          <w:sz w:val="28"/>
+          <w:szCs w:val="28"/>
+          <w:shd w:val="clear" w:fill="FFFFFF"/>
+          <w:lang w:val="en-US" w:eastAsia="zh-CN"/>
+        </w:rPr>
+        <w:t>还有1,000HKD的股票返现卷可以使用。</w:t>
       </w:r>
     </w:p>
     <w:p>
@@ -1436,14 +1908,21 @@
         <w:ind w:left="0" w:firstLine="0"/>
         <w:jc w:val="left"/>
         <w:rPr>
+          <w:rFonts w:hint="default" w:ascii="Segoe UI" w:hAnsi="Segoe UI" w:eastAsia="宋体" w:cs="Segoe UI"/>
+          <w:i w:val="0"/>
+          <w:iCs w:val="0"/>
+          <w:caps w:val="0"/>
+          <w:color w:val="000000"/>
+          <w:spacing w:val="0"/>
           <w:sz w:val="28"/>
           <w:szCs w:val="28"/>
-          <w:highlight w:val="yellow"/>
-        </w:rPr>
-      </w:pPr>
-      <w:r>
-        <w:rPr>
-          <w:rFonts w:hint="default" w:ascii="Segoe UI" w:hAnsi="Segoe UI" w:eastAsia="Segoe UI" w:cs="Segoe UI"/>
+          <w:shd w:val="clear" w:fill="FFFFFF"/>
+          <w:lang w:val="en-US" w:eastAsia="zh-CN"/>
+        </w:rPr>
+      </w:pPr>
+      <w:r>
+        <w:rPr>
+          <w:rFonts w:hint="eastAsia" w:ascii="Segoe UI" w:hAnsi="Segoe UI" w:eastAsia="宋体" w:cs="Segoe UI"/>
           <w:i w:val="0"/>
           <w:iCs w:val="0"/>
           <w:caps w:val="0"/>
@@ -1451,41 +1930,10 @@
           <w:spacing w:val="0"/>
           <w:sz w:val="28"/>
           <w:szCs w:val="28"/>
-          <w:highlight w:val="yellow"/>
-          <w:shd w:val="clear" w:fill="FFFFFF"/>
-        </w:rPr>
-        <w:t>股票： 日终股票总资产≥HKD 10,000 或其等值;(这个最容易完成，买一万股票</w:t>
-      </w:r>
-      <w:r>
-        <w:rPr>
-          <w:rFonts w:hint="eastAsia" w:ascii="Segoe UI" w:hAnsi="Segoe UI" w:eastAsia="宋体" w:cs="Segoe UI"/>
-          <w:i w:val="0"/>
-          <w:iCs w:val="0"/>
-          <w:caps w:val="0"/>
-          <w:color w:val="000000"/>
-          <w:spacing w:val="0"/>
-          <w:sz w:val="28"/>
-          <w:szCs w:val="28"/>
-          <w:highlight w:val="yellow"/>
-          <w:shd w:val="clear" w:fill="FFFFFF"/>
-          <w:lang w:val="en-US" w:eastAsia="zh-CN"/>
-        </w:rPr>
-        <w:t>(等值港股或美股)</w:t>
-      </w:r>
-      <w:r>
-        <w:rPr>
-          <w:rFonts w:hint="default" w:ascii="Segoe UI" w:hAnsi="Segoe UI" w:eastAsia="Segoe UI" w:cs="Segoe UI"/>
-          <w:i w:val="0"/>
-          <w:iCs w:val="0"/>
-          <w:caps w:val="0"/>
-          <w:color w:val="000000"/>
-          <w:spacing w:val="0"/>
-          <w:sz w:val="28"/>
-          <w:szCs w:val="28"/>
-          <w:highlight w:val="yellow"/>
-          <w:shd w:val="clear" w:fill="FFFFFF"/>
-        </w:rPr>
-        <w:t>放一个交易日过夜即可）</w:t>
+          <w:shd w:val="clear" w:fill="FFFFFF"/>
+          <w:lang w:val="en-US" w:eastAsia="zh-CN"/>
+        </w:rPr>
+        <w:t>入金可使用内地银行“跨境支付通”功能免费入金HKD/CNY</w:t>
       </w:r>
     </w:p>
     <w:p>
@@ -1499,7 +1947,7 @@
         <w:ind w:left="0" w:firstLine="0"/>
         <w:jc w:val="left"/>
         <w:rPr>
-          <w:rFonts w:ascii="Segoe UI" w:hAnsi="Segoe UI" w:eastAsia="Segoe UI" w:cs="Segoe UI"/>
+          <w:rFonts w:hint="eastAsia" w:ascii="Segoe UI" w:hAnsi="Segoe UI" w:eastAsia="宋体" w:cs="Segoe UI"/>
           <w:i w:val="0"/>
           <w:iCs w:val="0"/>
           <w:caps w:val="0"/>
@@ -1507,11 +1955,13 @@
           <w:spacing w:val="0"/>
           <w:sz w:val="28"/>
           <w:szCs w:val="28"/>
-        </w:rPr>
-      </w:pPr>
-      <w:r>
-        <w:rPr>
-          <w:rFonts w:hint="default" w:ascii="Segoe UI" w:hAnsi="Segoe UI" w:eastAsia="Segoe UI" w:cs="Segoe UI"/>
+          <w:shd w:val="clear" w:fill="FFFFFF"/>
+          <w:lang w:val="en-US" w:eastAsia="zh-CN"/>
+        </w:rPr>
+      </w:pPr>
+      <w:r>
+        <w:rPr>
+          <w:rFonts w:hint="eastAsia" w:ascii="Segoe UI" w:hAnsi="Segoe UI" w:eastAsia="宋体" w:cs="Segoe UI"/>
           <w:i w:val="0"/>
           <w:iCs w:val="0"/>
           <w:caps w:val="0"/>
@@ -1520,270 +1970,12 @@
           <w:sz w:val="28"/>
           <w:szCs w:val="28"/>
           <w:shd w:val="clear" w:fill="FFFFFF"/>
-        </w:rPr>
-        <w:t>返现机制： 达成以上任一条件后:，系统将在次日晚上 21:00 前处理。核对无误后，我将直接通过 ZA Bank 转账300 HKD，或按</w:t>
-      </w:r>
-      <w:r>
-        <w:rPr>
-          <w:rFonts w:hint="eastAsia" w:ascii="Segoe UI" w:hAnsi="Segoe UI" w:eastAsia="宋体" w:cs="Segoe UI"/>
-          <w:i w:val="0"/>
-          <w:iCs w:val="0"/>
-          <w:caps w:val="0"/>
-          <w:color w:val="000000"/>
-          <w:spacing w:val="0"/>
-          <w:sz w:val="28"/>
-          <w:szCs w:val="28"/>
-          <w:shd w:val="clear" w:fill="FFFFFF"/>
-          <w:lang w:val="en-US" w:eastAsia="zh-CN"/>
-        </w:rPr>
-        <w:t>ZA Bank</w:t>
-      </w:r>
-      <w:r>
-        <w:rPr>
-          <w:rFonts w:hint="default" w:ascii="Segoe UI" w:hAnsi="Segoe UI" w:eastAsia="Segoe UI" w:cs="Segoe UI"/>
-          <w:i w:val="0"/>
-          <w:iCs w:val="0"/>
-          <w:caps w:val="0"/>
-          <w:color w:val="000000"/>
-          <w:spacing w:val="0"/>
-          <w:sz w:val="28"/>
-          <w:szCs w:val="28"/>
-          <w:shd w:val="clear" w:fill="FFFFFF"/>
-        </w:rPr>
-        <w:t>实时汇率通过微信/支付宝返还你</w:t>
-      </w:r>
-      <w:r>
-        <w:rPr>
-          <w:rFonts w:hint="eastAsia" w:ascii="Segoe UI" w:hAnsi="Segoe UI" w:eastAsia="宋体" w:cs="Segoe UI"/>
-          <w:i w:val="0"/>
-          <w:iCs w:val="0"/>
-          <w:caps w:val="0"/>
-          <w:color w:val="000000"/>
-          <w:spacing w:val="0"/>
-          <w:sz w:val="28"/>
-          <w:szCs w:val="28"/>
-          <w:shd w:val="clear" w:fill="FFFFFF"/>
-          <w:lang w:val="en-US" w:eastAsia="zh-CN"/>
-        </w:rPr>
-        <w:t>等值RMB</w:t>
-      </w:r>
-      <w:r>
-        <w:rPr>
-          <w:rFonts w:hint="default" w:ascii="Segoe UI" w:hAnsi="Segoe UI" w:eastAsia="Segoe UI" w:cs="Segoe UI"/>
-          <w:i w:val="0"/>
-          <w:iCs w:val="0"/>
-          <w:caps w:val="0"/>
-          <w:color w:val="000000"/>
-          <w:spacing w:val="0"/>
-          <w:sz w:val="28"/>
-          <w:szCs w:val="28"/>
-          <w:shd w:val="clear" w:fill="FFFFFF"/>
-        </w:rPr>
-        <w:t xml:space="preserve">  </w:t>
-      </w:r>
-    </w:p>
-    <w:p>
-      <w:pPr>
-        <w:pStyle w:val="7"/>
-        <w:keepNext w:val="0"/>
-        <w:keepLines w:val="0"/>
-        <w:widowControl/>
-        <w:suppressLineNumbers w:val="0"/>
-        <w:shd w:val="clear" w:fill="FFFFFF"/>
-        <w:ind w:left="0" w:firstLine="0"/>
-        <w:jc w:val="left"/>
-        <w:rPr>
-          <w:rFonts w:hint="default" w:ascii="Segoe UI" w:hAnsi="Segoe UI" w:eastAsia="宋体" w:cs="Segoe UI"/>
-          <w:i w:val="0"/>
-          <w:iCs w:val="0"/>
-          <w:caps w:val="0"/>
-          <w:color w:val="000000"/>
-          <w:spacing w:val="0"/>
-          <w:sz w:val="28"/>
-          <w:szCs w:val="28"/>
-          <w:lang w:val="en-US" w:eastAsia="zh-CN"/>
-        </w:rPr>
-      </w:pPr>
-      <w:r>
-        <w:rPr>
-          <w:rFonts w:hint="default" w:ascii="Segoe UI" w:hAnsi="Segoe UI" w:eastAsia="Segoe UI" w:cs="Segoe UI"/>
-          <w:i w:val="0"/>
-          <w:iCs w:val="0"/>
-          <w:caps w:val="0"/>
-          <w:color w:val="000000"/>
-          <w:spacing w:val="0"/>
-          <w:sz w:val="28"/>
-          <w:szCs w:val="28"/>
-          <w:shd w:val="clear" w:fill="FFFFFF"/>
-        </w:rPr>
-        <w:t>另外，被邀请人维持此条件累计达 7 天(无需连续): 日终股票总资产≥HKD10</w:t>
-      </w:r>
-      <w:r>
-        <w:rPr>
-          <w:rFonts w:hint="eastAsia" w:ascii="Segoe UI" w:hAnsi="Segoe UI" w:eastAsia="宋体" w:cs="Segoe UI"/>
-          <w:i w:val="0"/>
-          <w:iCs w:val="0"/>
-          <w:caps w:val="0"/>
-          <w:color w:val="000000"/>
-          <w:spacing w:val="0"/>
-          <w:sz w:val="28"/>
-          <w:szCs w:val="28"/>
-          <w:shd w:val="clear" w:fill="FFFFFF"/>
-          <w:lang w:val="en-US" w:eastAsia="zh-CN"/>
-        </w:rPr>
-        <w:t>,</w:t>
-      </w:r>
-      <w:r>
-        <w:rPr>
-          <w:rFonts w:hint="default" w:ascii="Segoe UI" w:hAnsi="Segoe UI" w:eastAsia="Segoe UI" w:cs="Segoe UI"/>
-          <w:i w:val="0"/>
-          <w:iCs w:val="0"/>
-          <w:caps w:val="0"/>
-          <w:color w:val="000000"/>
-          <w:spacing w:val="0"/>
-          <w:sz w:val="28"/>
-          <w:szCs w:val="28"/>
-          <w:shd w:val="clear" w:fill="FFFFFF"/>
-        </w:rPr>
-        <w:t>000 或其等值; 或日终基金总资产 HKD100</w:t>
-      </w:r>
-      <w:r>
-        <w:rPr>
-          <w:rFonts w:hint="eastAsia" w:ascii="Segoe UI" w:hAnsi="Segoe UI" w:eastAsia="宋体" w:cs="Segoe UI"/>
-          <w:i w:val="0"/>
-          <w:iCs w:val="0"/>
-          <w:caps w:val="0"/>
-          <w:color w:val="000000"/>
-          <w:spacing w:val="0"/>
-          <w:sz w:val="28"/>
-          <w:szCs w:val="28"/>
-          <w:shd w:val="clear" w:fill="FFFFFF"/>
-          <w:lang w:val="en-US" w:eastAsia="zh-CN"/>
-        </w:rPr>
-        <w:t>,</w:t>
-      </w:r>
-      <w:r>
-        <w:rPr>
-          <w:rFonts w:hint="default" w:ascii="Segoe UI" w:hAnsi="Segoe UI" w:eastAsia="Segoe UI" w:cs="Segoe UI"/>
-          <w:i w:val="0"/>
-          <w:iCs w:val="0"/>
-          <w:caps w:val="0"/>
-          <w:color w:val="000000"/>
-          <w:spacing w:val="0"/>
-          <w:sz w:val="28"/>
-          <w:szCs w:val="28"/>
-          <w:shd w:val="clear" w:fill="FFFFFF"/>
-        </w:rPr>
-        <w:t>000 或其等值;或日终存款余额≥HKD200,000 或其等值（只需满足其中一个条件）即可前往 ZA Quest7 领取 1 张 USD30 美光科技(MU) 指定美股兑换券</w:t>
-      </w:r>
-      <w:r>
-        <w:rPr>
-          <w:rFonts w:hint="eastAsia" w:ascii="Segoe UI" w:hAnsi="Segoe UI" w:eastAsia="宋体" w:cs="Segoe UI"/>
-          <w:i w:val="0"/>
-          <w:iCs w:val="0"/>
-          <w:caps w:val="0"/>
-          <w:color w:val="000000"/>
-          <w:spacing w:val="0"/>
-          <w:sz w:val="28"/>
-          <w:szCs w:val="28"/>
-          <w:shd w:val="clear" w:fill="FFFFFF"/>
-          <w:lang w:eastAsia="zh-CN"/>
-        </w:rPr>
-        <w:t>。</w:t>
-      </w:r>
-      <w:r>
-        <w:rPr>
-          <w:rFonts w:hint="eastAsia" w:ascii="Segoe UI" w:hAnsi="Segoe UI" w:eastAsia="宋体" w:cs="Segoe UI"/>
-          <w:i w:val="0"/>
-          <w:iCs w:val="0"/>
-          <w:caps w:val="0"/>
-          <w:color w:val="000000"/>
-          <w:spacing w:val="0"/>
-          <w:sz w:val="28"/>
-          <w:szCs w:val="28"/>
-          <w:shd w:val="clear" w:fill="FFFFFF"/>
-          <w:lang w:val="en-US" w:eastAsia="zh-CN"/>
-        </w:rPr>
-        <w:t>还有1,000HKD的股票返现卷可以使用。</w:t>
-      </w:r>
-    </w:p>
-    <w:p>
-      <w:pPr>
-        <w:pStyle w:val="7"/>
-        <w:keepNext w:val="0"/>
-        <w:keepLines w:val="0"/>
-        <w:widowControl/>
-        <w:suppressLineNumbers w:val="0"/>
-        <w:shd w:val="clear" w:fill="FFFFFF"/>
-        <w:ind w:left="0" w:firstLine="0"/>
-        <w:jc w:val="left"/>
-        <w:rPr>
-          <w:rFonts w:hint="default" w:ascii="Segoe UI" w:hAnsi="Segoe UI" w:eastAsia="宋体" w:cs="Segoe UI"/>
-          <w:i w:val="0"/>
-          <w:iCs w:val="0"/>
-          <w:caps w:val="0"/>
-          <w:color w:val="000000"/>
-          <w:spacing w:val="0"/>
-          <w:sz w:val="28"/>
-          <w:szCs w:val="28"/>
-          <w:shd w:val="clear" w:fill="FFFFFF"/>
-          <w:lang w:val="en-US" w:eastAsia="zh-CN"/>
-        </w:rPr>
-      </w:pPr>
-      <w:r>
-        <w:rPr>
-          <w:rFonts w:hint="eastAsia" w:ascii="Segoe UI" w:hAnsi="Segoe UI" w:eastAsia="宋体" w:cs="Segoe UI"/>
-          <w:i w:val="0"/>
-          <w:iCs w:val="0"/>
-          <w:caps w:val="0"/>
-          <w:color w:val="000000"/>
-          <w:spacing w:val="0"/>
-          <w:sz w:val="28"/>
-          <w:szCs w:val="28"/>
-          <w:shd w:val="clear" w:fill="FFFFFF"/>
-          <w:lang w:val="en-US" w:eastAsia="zh-CN"/>
-        </w:rPr>
-        <w:t>入金可使用内地银行“跨境支付通”功能免费入金HKD/CNY</w:t>
-      </w:r>
-    </w:p>
-    <w:p>
-      <w:pPr>
-        <w:pStyle w:val="7"/>
-        <w:keepNext w:val="0"/>
-        <w:keepLines w:val="0"/>
-        <w:widowControl/>
-        <w:suppressLineNumbers w:val="0"/>
-        <w:shd w:val="clear" w:fill="FFFFFF"/>
-        <w:ind w:left="0" w:firstLine="0"/>
-        <w:jc w:val="left"/>
-        <w:rPr>
-          <w:rFonts w:hint="default" w:ascii="Segoe UI" w:hAnsi="Segoe UI" w:eastAsia="宋体" w:cs="Segoe UI"/>
-          <w:i w:val="0"/>
-          <w:iCs w:val="0"/>
-          <w:caps w:val="0"/>
-          <w:color w:val="000000"/>
-          <w:spacing w:val="0"/>
-          <w:sz w:val="28"/>
-          <w:szCs w:val="28"/>
-          <w:shd w:val="clear" w:fill="FFFFFF"/>
-          <w:lang w:val="en-US" w:eastAsia="zh-CN"/>
-        </w:rPr>
-      </w:pPr>
-      <w:r>
-        <w:rPr>
-          <w:rFonts w:hint="eastAsia" w:ascii="Segoe UI" w:hAnsi="Segoe UI" w:eastAsia="宋体" w:cs="Segoe UI"/>
-          <w:i w:val="0"/>
-          <w:iCs w:val="0"/>
-          <w:caps w:val="0"/>
-          <w:color w:val="000000"/>
-          <w:spacing w:val="0"/>
-          <w:sz w:val="28"/>
-          <w:szCs w:val="28"/>
-          <w:shd w:val="clear" w:fill="FFFFFF"/>
-          <w:lang w:val="en-US" w:eastAsia="zh-CN"/>
-        </w:rPr>
-        <w:t>需要USD的话建议从众安银行兑换汇率较好</w:t>
-      </w:r>
+          <w:lang w:val="en-US" w:eastAsia="zh-CN"/>
+        </w:rPr>
+        <w:t>需要USD的话建议从众安银行用卷兑换汇率较好</w:t>
+      </w:r>
+      <w:bookmarkStart w:id="0" w:name="_GoBack"/>
+      <w:bookmarkEnd w:id="0"/>
     </w:p>
     <w:p>
       <w:pPr>
@@ -1901,7 +2093,7 @@
     <w:p>
       <w:pPr>
         <w:rPr>
-          <w:rFonts w:hint="eastAsia"/>
+          <w:rFonts w:hint="default"/>
           <w:sz w:val="44"/>
           <w:szCs w:val="44"/>
           <w:lang w:val="en-US" w:eastAsia="zh-CN"/>
@@ -1914,7 +2106,7 @@
           <w:szCs w:val="44"/>
           <w:lang w:val="en-US" w:eastAsia="zh-CN"/>
         </w:rPr>
-        <w:t>我可返200RMB</w:t>
+        <w:t>我可返300HKD</w:t>
       </w:r>
     </w:p>
     <w:p>
@@ -2154,26 +2346,6 @@
           <w:lang w:val="en-US" w:eastAsia="zh-CN"/>
         </w:rPr>
       </w:pPr>
-    </w:p>
-    <w:p>
-      <w:pPr>
-        <w:rPr>
-          <w:rFonts w:hint="eastAsia"/>
-          <w:sz w:val="48"/>
-          <w:szCs w:val="48"/>
-          <w:lang w:val="en-US" w:eastAsia="zh-CN"/>
-        </w:rPr>
-      </w:pPr>
-    </w:p>
-    <w:p>
-      <w:pPr>
-        <w:rPr>
-          <w:rFonts w:hint="eastAsia"/>
-          <w:sz w:val="48"/>
-          <w:szCs w:val="48"/>
-          <w:lang w:val="en-US" w:eastAsia="zh-CN"/>
-        </w:rPr>
-      </w:pPr>
       <w:r>
         <w:rPr>
           <w:rFonts w:hint="eastAsia"/>
@@ -2247,26 +2419,36 @@
           <w:szCs w:val="48"/>
           <w:lang w:val="en-US" w:eastAsia="zh-CN"/>
         </w:rPr>
-        <w:t>填邀请码注册活动：注册一个月内首次入金≥10,000港币（或等值美刀）</w:t>
-      </w:r>
-    </w:p>
-    <w:p>
-      <w:pPr>
-        <w:rPr>
-          <w:rFonts w:hint="eastAsia"/>
-          <w:sz w:val="48"/>
-          <w:szCs w:val="48"/>
-          <w:lang w:val="en-US" w:eastAsia="zh-CN"/>
-        </w:rPr>
-      </w:pPr>
-      <w:r>
-        <w:rPr>
-          <w:rFonts w:hint="eastAsia"/>
-          <w:sz w:val="48"/>
-          <w:szCs w:val="48"/>
-          <w:lang w:val="en-US" w:eastAsia="zh-CN"/>
-        </w:rPr>
-        <w:t>我可返100HKD</w:t>
+        <w:t>填邀请码注册活动：注册一个月内首次入金≥10,000港币（或等值美刀）连续持有三天过夜</w:t>
+      </w:r>
+    </w:p>
+    <w:p>
+      <w:pPr>
+        <w:rPr>
+          <w:rFonts w:hint="eastAsia"/>
+          <w:sz w:val="48"/>
+          <w:szCs w:val="48"/>
+          <w:lang w:val="en-US" w:eastAsia="zh-CN"/>
+        </w:rPr>
+      </w:pPr>
+      <w:r>
+        <w:rPr>
+          <w:rFonts w:hint="eastAsia"/>
+          <w:sz w:val="48"/>
+          <w:szCs w:val="48"/>
+          <w:lang w:val="en-US" w:eastAsia="zh-CN"/>
+        </w:rPr>
+        <w:t>我可返</w:t>
+      </w:r>
+      <w:r>
+        <w:rPr>
+          <w:rFonts w:hint="eastAsia"/>
+          <w:color w:val="FF0000"/>
+          <w:sz w:val="48"/>
+          <w:szCs w:val="48"/>
+          <w:lang w:val="en-US" w:eastAsia="zh-CN"/>
+        </w:rPr>
+        <w:t>300HKD</w:t>
       </w:r>
     </w:p>
     <w:p>
@@ -2396,7 +2578,7 @@
     <w:p>
       <w:pPr>
         <w:rPr>
-          <w:rFonts w:hint="default"/>
+          <w:rFonts w:hint="eastAsia"/>
           <w:lang w:val="en-US" w:eastAsia="zh-CN"/>
         </w:rPr>
       </w:pPr>
@@ -2423,7 +2605,7 @@
                     </pic:cNvPicPr>
                   </pic:nvPicPr>
                   <pic:blipFill>
-                    <a:blip r:embed="rId4"/>
+                    <a:blip r:embed="rId5"/>
                     <a:stretch>
                       <a:fillRect/>
                     </a:stretch>
@@ -2454,6 +2636,241 @@
     <w:p>
       <w:pPr>
         <w:rPr>
+          <w:rFonts w:hint="default"/>
+          <w:lang w:val="en-US" w:eastAsia="zh-CN"/>
+        </w:rPr>
+      </w:pPr>
+      <w:r>
+        <w:rPr>
+          <w:rFonts w:hint="default"/>
+          <w:lang w:val="en-US" w:eastAsia="zh-CN"/>
+        </w:rPr>
+        <w:drawing>
+          <wp:inline distT="0" distB="0" distL="114300" distR="114300">
+            <wp:extent cx="2670810" cy="3982085"/>
+            <wp:effectExtent l="0" t="0" r="8890" b="5715"/>
+            <wp:docPr id="2" name="图片 2" descr="fusion"/>
+            <wp:cNvGraphicFramePr>
+              <a:graphicFrameLocks xmlns:a="http://schemas.openxmlformats.org/drawingml/2006/main" noChangeAspect="1"/>
+            </wp:cNvGraphicFramePr>
+            <a:graphic xmlns:a="http://schemas.openxmlformats.org/drawingml/2006/main">
+              <a:graphicData uri="http://schemas.openxmlformats.org/drawingml/2006/picture">
+                <pic:pic xmlns:pic="http://schemas.openxmlformats.org/drawingml/2006/picture">
+                  <pic:nvPicPr>
+                    <pic:cNvPr id="2" name="图片 2" descr="fusion"/>
+                    <pic:cNvPicPr>
+                      <a:picLocks noChangeAspect="1"/>
+                    </pic:cNvPicPr>
+                  </pic:nvPicPr>
+                  <pic:blipFill>
+                    <a:blip r:embed="rId6"/>
+                    <a:stretch>
+                      <a:fillRect/>
+                    </a:stretch>
+                  </pic:blipFill>
+                  <pic:spPr>
+                    <a:xfrm>
+                      <a:off x="0" y="0"/>
+                      <a:ext cx="2670810" cy="3982085"/>
+                    </a:xfrm>
+                    <a:prstGeom prst="rect">
+                      <a:avLst/>
+                    </a:prstGeom>
+                  </pic:spPr>
+                </pic:pic>
+              </a:graphicData>
+            </a:graphic>
+          </wp:inline>
+        </w:drawing>
+      </w:r>
+    </w:p>
+    <w:p>
+      <w:pPr>
+        <w:rPr>
+          <w:rFonts w:hint="default"/>
+          <w:lang w:val="en-US" w:eastAsia="zh-CN"/>
+        </w:rPr>
+      </w:pPr>
+    </w:p>
+    <w:p>
+      <w:pPr>
+        <w:rPr>
+          <w:rFonts w:hint="default"/>
+          <w:lang w:val="en-US" w:eastAsia="zh-CN"/>
+        </w:rPr>
+      </w:pPr>
+    </w:p>
+    <w:p>
+      <w:pPr>
+        <w:rPr>
+          <w:rFonts w:hint="eastAsia"/>
+          <w:b/>
+          <w:bCs/>
+          <w:color w:val="FF0000"/>
+          <w:sz w:val="44"/>
+          <w:szCs w:val="44"/>
+          <w:lang w:val="en-US" w:eastAsia="zh-CN"/>
+        </w:rPr>
+      </w:pPr>
+      <w:r>
+        <w:rPr>
+          <w:rFonts w:hint="eastAsia"/>
+          <w:b/>
+          <w:bCs/>
+          <w:color w:val="FF0000"/>
+          <w:sz w:val="44"/>
+          <w:szCs w:val="44"/>
+          <w:lang w:val="en-US" w:eastAsia="zh-CN"/>
+        </w:rPr>
+        <w:t>复星在入金前注意检查一下有没有填到邀请码！！</w:t>
+      </w:r>
+    </w:p>
+    <w:p>
+      <w:pPr>
+        <w:rPr>
+          <w:rFonts w:hint="eastAsia"/>
+          <w:b/>
+          <w:bCs/>
+          <w:color w:val="FF0000"/>
+          <w:sz w:val="44"/>
+          <w:szCs w:val="44"/>
+          <w:lang w:val="en-US" w:eastAsia="zh-CN"/>
+        </w:rPr>
+      </w:pPr>
+      <w:r>
+        <w:rPr>
+          <w:rFonts w:hint="eastAsia"/>
+          <w:b/>
+          <w:bCs/>
+          <w:color w:val="FF0000"/>
+          <w:sz w:val="44"/>
+          <w:szCs w:val="44"/>
+          <w:lang w:val="en-US" w:eastAsia="zh-CN"/>
+        </w:rPr>
+        <w:t>显示空白的话就返现不了了！一定要注意</w:t>
+      </w:r>
+    </w:p>
+    <w:p>
+      <w:pPr>
+        <w:rPr>
+          <w:rFonts w:hint="default"/>
+          <w:color w:val="FF0000"/>
+          <w:sz w:val="32"/>
+          <w:szCs w:val="32"/>
+          <w:lang w:val="en-US" w:eastAsia="zh-CN"/>
+        </w:rPr>
+      </w:pPr>
+    </w:p>
+    <w:p>
+      <w:pPr>
+        <w:rPr>
+          <w:rFonts w:hint="default"/>
+          <w:sz w:val="32"/>
+          <w:szCs w:val="32"/>
+          <w:lang w:val="en-US" w:eastAsia="zh-CN"/>
+        </w:rPr>
+      </w:pPr>
+      <w:r>
+        <w:rPr>
+          <w:rFonts w:hint="eastAsia"/>
+          <w:sz w:val="32"/>
+          <w:szCs w:val="32"/>
+          <w:lang w:val="en-US" w:eastAsia="zh-CN"/>
+        </w:rPr>
+        <w:t>星财富➡️我的➡️邀请好友➡️我的邀请人</w:t>
+      </w:r>
+    </w:p>
+    <w:p>
+      <w:pPr>
+        <w:rPr>
+          <w:rFonts w:hint="default"/>
+          <w:lang w:val="en-US" w:eastAsia="zh-CN"/>
+        </w:rPr>
+      </w:pPr>
+    </w:p>
+    <w:p>
+      <w:pPr>
+        <w:rPr>
+          <w:rFonts w:hint="default"/>
+          <w:lang w:val="en-US" w:eastAsia="zh-CN"/>
+        </w:rPr>
+      </w:pPr>
+    </w:p>
+    <w:p>
+      <w:pPr>
+        <w:rPr>
+          <w:rFonts w:hint="default"/>
+          <w:lang w:val="en-US" w:eastAsia="zh-CN"/>
+        </w:rPr>
+      </w:pPr>
+    </w:p>
+    <w:p>
+      <w:pPr>
+        <w:rPr>
+          <w:rFonts w:hint="default"/>
+          <w:lang w:val="en-US" w:eastAsia="zh-CN"/>
+        </w:rPr>
+      </w:pPr>
+    </w:p>
+    <w:p>
+      <w:pPr>
+        <w:rPr>
+          <w:rFonts w:hint="default"/>
+          <w:lang w:val="en-US" w:eastAsia="zh-CN"/>
+        </w:rPr>
+      </w:pPr>
+    </w:p>
+    <w:p>
+      <w:pPr>
+        <w:rPr>
+          <w:rFonts w:hint="default"/>
+          <w:lang w:val="en-US" w:eastAsia="zh-CN"/>
+        </w:rPr>
+      </w:pPr>
+    </w:p>
+    <w:p>
+      <w:pPr>
+        <w:rPr>
+          <w:rFonts w:hint="default"/>
+          <w:lang w:val="en-US" w:eastAsia="zh-CN"/>
+        </w:rPr>
+      </w:pPr>
+    </w:p>
+    <w:p>
+      <w:pPr>
+        <w:rPr>
+          <w:rFonts w:hint="default"/>
+          <w:lang w:val="en-US" w:eastAsia="zh-CN"/>
+        </w:rPr>
+      </w:pPr>
+    </w:p>
+    <w:p>
+      <w:pPr>
+        <w:rPr>
+          <w:rFonts w:hint="default"/>
+          <w:lang w:val="en-US" w:eastAsia="zh-CN"/>
+        </w:rPr>
+      </w:pPr>
+    </w:p>
+    <w:p>
+      <w:pPr>
+        <w:rPr>
+          <w:rFonts w:hint="default"/>
+          <w:lang w:val="en-US" w:eastAsia="zh-CN"/>
+        </w:rPr>
+      </w:pPr>
+    </w:p>
+    <w:p>
+      <w:pPr>
+        <w:rPr>
+          <w:rFonts w:hint="default"/>
+          <w:lang w:val="en-US" w:eastAsia="zh-CN"/>
+        </w:rPr>
+      </w:pPr>
+    </w:p>
+    <w:p>
+      <w:pPr>
+        <w:rPr>
           <w:rFonts w:hint="eastAsia"/>
           <w:sz w:val="48"/>
           <w:szCs w:val="48"/>
@@ -2498,59 +2915,669 @@
           <w:lang w:val="en-US" w:eastAsia="zh-CN"/>
         </w:rPr>
       </w:pPr>
-    </w:p>
-    <w:p>
-      <w:pPr>
-        <w:rPr>
-          <w:rFonts w:hint="eastAsia"/>
-          <w:sz w:val="48"/>
-          <w:szCs w:val="48"/>
-          <w:lang w:val="en-US" w:eastAsia="zh-CN"/>
-        </w:rPr>
-      </w:pPr>
-      <w:r>
-        <w:rPr>
-          <w:rFonts w:hint="eastAsia"/>
-          <w:sz w:val="48"/>
-          <w:szCs w:val="48"/>
-          <w:lang w:val="en-US" w:eastAsia="zh-CN"/>
-        </w:rPr>
-        <w:t>填邀请码注册活动：持有10000港币等值港股或美股过夜，我可返300港币。</w:t>
-      </w:r>
-    </w:p>
-    <w:p>
-      <w:pPr>
-        <w:rPr>
-          <w:rFonts w:hint="default"/>
-          <w:sz w:val="48"/>
-          <w:szCs w:val="48"/>
-          <w:lang w:val="en-US" w:eastAsia="zh-CN"/>
-        </w:rPr>
-      </w:pPr>
-      <w:r>
-        <w:rPr>
-          <w:rFonts w:hint="eastAsia"/>
-          <w:sz w:val="48"/>
-          <w:szCs w:val="48"/>
-          <w:lang w:val="en-US" w:eastAsia="zh-CN"/>
-        </w:rPr>
-        <w:t>填邀请码您自己可额外获得30刀和660+HKD奖励</w:t>
-      </w:r>
-    </w:p>
-    <w:p>
-      <w:pPr>
-        <w:rPr>
-          <w:rFonts w:hint="default"/>
-          <w:sz w:val="48"/>
-          <w:szCs w:val="48"/>
-          <w:lang w:val="en-US" w:eastAsia="zh-CN"/>
-        </w:rPr>
-      </w:pPr>
-    </w:p>
-    <w:p>
-      <w:pPr>
-        <w:rPr>
-          <w:rFonts w:hint="eastAsia"/>
+      <w:r>
+        <w:rPr>
+          <w:rFonts w:hint="eastAsia"/>
+          <w:sz w:val="48"/>
+          <w:szCs w:val="48"/>
+          <w:lang w:val="en-US" w:eastAsia="zh-CN"/>
+        </w:rPr>
+        <w:t>邀请码LN7258</w:t>
+      </w:r>
+    </w:p>
+    <w:p>
+      <w:pPr>
+        <w:rPr>
+          <w:rFonts w:hint="default"/>
+          <w:sz w:val="48"/>
+          <w:szCs w:val="48"/>
+          <w:lang w:val="en-US" w:eastAsia="zh-CN"/>
+        </w:rPr>
+      </w:pPr>
+      <w:r>
+        <w:rPr>
+          <w:rFonts w:hint="eastAsia"/>
+          <w:sz w:val="48"/>
+          <w:szCs w:val="48"/>
+          <w:lang w:val="en-US" w:eastAsia="zh-CN"/>
+        </w:rPr>
+        <w:t>返500HKD</w:t>
+      </w:r>
+    </w:p>
+    <w:p>
+      <w:pPr>
+        <w:rPr>
+          <w:rFonts w:hint="eastAsia"/>
+          <w:sz w:val="48"/>
+          <w:szCs w:val="48"/>
+          <w:lang w:val="en-US" w:eastAsia="zh-CN"/>
+        </w:rPr>
+      </w:pPr>
+    </w:p>
+    <w:p>
+      <w:pPr>
+        <w:rPr>
+          <w:rFonts w:hint="eastAsia"/>
+          <w:sz w:val="48"/>
+          <w:szCs w:val="48"/>
+          <w:lang w:val="en-US" w:eastAsia="zh-CN"/>
+        </w:rPr>
+      </w:pPr>
+      <w:r>
+        <w:rPr>
+          <w:rFonts w:hint="eastAsia"/>
+          <w:sz w:val="48"/>
+          <w:szCs w:val="48"/>
+          <w:lang w:val="en-US" w:eastAsia="zh-CN"/>
+        </w:rPr>
+        <w:t>填邀请码注册活动更新：</w:t>
+      </w:r>
+    </w:p>
+    <w:p>
+      <w:pPr>
+        <w:rPr>
+          <w:rFonts w:hint="eastAsia"/>
+          <w:sz w:val="48"/>
+          <w:szCs w:val="48"/>
+          <w:lang w:val="en-US" w:eastAsia="zh-CN"/>
+        </w:rPr>
+      </w:pPr>
+      <w:r>
+        <w:rPr>
+          <w:rFonts w:hint="eastAsia"/>
+          <w:sz w:val="48"/>
+          <w:szCs w:val="48"/>
+          <w:lang w:val="en-US" w:eastAsia="zh-CN"/>
+        </w:rPr>
+        <w:t>开户14天内，持有≥1,000HKD等值总结余（存款、股票、基金，这三样需要同时持有过夜），可以返</w:t>
+      </w:r>
+      <w:r>
+        <w:rPr>
+          <w:rFonts w:hint="eastAsia"/>
+          <w:color w:val="FF0000"/>
+          <w:sz w:val="48"/>
+          <w:szCs w:val="48"/>
+          <w:lang w:val="en-US" w:eastAsia="zh-CN"/>
+        </w:rPr>
+        <w:t>300HKD</w:t>
+      </w:r>
+      <w:r>
+        <w:rPr>
+          <w:rFonts w:hint="eastAsia"/>
+          <w:sz w:val="48"/>
+          <w:szCs w:val="48"/>
+          <w:lang w:val="en-US" w:eastAsia="zh-CN"/>
+        </w:rPr>
+        <w:t>。</w:t>
+      </w:r>
+    </w:p>
+    <w:p>
+      <w:pPr>
+        <w:jc w:val="both"/>
+        <w:rPr>
+          <w:rFonts w:hint="eastAsia"/>
+          <w:color w:val="000000" w:themeColor="text1"/>
+          <w:sz w:val="48"/>
+          <w:szCs w:val="48"/>
+          <w:lang w:val="en-US" w:eastAsia="zh-CN"/>
+          <w14:textFill>
+            <w14:solidFill>
+              <w14:schemeClr w14:val="tx1"/>
+            </w14:solidFill>
+          </w14:textFill>
+        </w:rPr>
+      </w:pPr>
+      <w:r>
+        <w:rPr>
+          <w:rFonts w:hint="eastAsia"/>
+          <w:color w:val="000000" w:themeColor="text1"/>
+          <w:sz w:val="48"/>
+          <w:szCs w:val="48"/>
+          <w:lang w:val="en-US" w:eastAsia="zh-CN"/>
+          <w14:textFill>
+            <w14:solidFill>
+              <w14:schemeClr w14:val="tx1"/>
+            </w14:solidFill>
+          </w14:textFill>
+        </w:rPr>
+        <w:t>累计持有≥10,000HKD等值股票市值14天（无需连续）可额外返200HKD</w:t>
+      </w:r>
+    </w:p>
+    <w:p>
+      <w:pPr>
+        <w:jc w:val="both"/>
+        <w:rPr>
+          <w:rFonts w:hint="default"/>
+          <w:color w:val="000000" w:themeColor="text1"/>
+          <w:sz w:val="48"/>
+          <w:szCs w:val="48"/>
+          <w:lang w:val="en-US" w:eastAsia="zh-CN"/>
+          <w14:textFill>
+            <w14:solidFill>
+              <w14:schemeClr w14:val="tx1"/>
+            </w14:solidFill>
+          </w14:textFill>
+        </w:rPr>
+      </w:pPr>
+      <w:r>
+        <w:rPr>
+          <w:rFonts w:hint="eastAsia"/>
+          <w:color w:val="000000" w:themeColor="text1"/>
+          <w:sz w:val="48"/>
+          <w:szCs w:val="48"/>
+          <w:lang w:val="en-US" w:eastAsia="zh-CN"/>
+          <w14:textFill>
+            <w14:solidFill>
+              <w14:schemeClr w14:val="tx1"/>
+            </w14:solidFill>
+          </w14:textFill>
+        </w:rPr>
+        <w:t>除此之外，维持7天股票市值≥10,000HKD，您可以领取30刀等值镁光股票(MU)。购买股票的同时可以用股票优惠卷。</w:t>
+      </w:r>
+    </w:p>
+    <w:p>
+      <w:pPr>
+        <w:jc w:val="both"/>
+        <w:rPr>
+          <w:rFonts w:hint="eastAsia"/>
+          <w:color w:val="000000" w:themeColor="text1"/>
+          <w:sz w:val="48"/>
+          <w:szCs w:val="48"/>
+          <w:lang w:val="en-US" w:eastAsia="zh-CN"/>
+          <w14:textFill>
+            <w14:solidFill>
+              <w14:schemeClr w14:val="tx1"/>
+            </w14:solidFill>
+          </w14:textFill>
+        </w:rPr>
+      </w:pPr>
+      <w:r>
+        <w:rPr>
+          <w:rFonts w:hint="eastAsia"/>
+          <w:color w:val="000000" w:themeColor="text1"/>
+          <w:sz w:val="48"/>
+          <w:szCs w:val="48"/>
+          <w:lang w:val="en-US" w:eastAsia="zh-CN"/>
+          <w14:textFill>
+            <w14:solidFill>
+              <w14:schemeClr w14:val="tx1"/>
+            </w14:solidFill>
+          </w14:textFill>
+        </w:rPr>
+        <w:t>推荐操作步骤：</w:t>
+      </w:r>
+    </w:p>
+    <w:p>
+      <w:pPr>
+        <w:jc w:val="both"/>
+        <w:rPr>
+          <w:rFonts w:hint="default"/>
+          <w:color w:val="000000" w:themeColor="text1"/>
+          <w:sz w:val="48"/>
+          <w:szCs w:val="48"/>
+          <w:lang w:val="en-US" w:eastAsia="zh-CN"/>
+          <w14:textFill>
+            <w14:solidFill>
+              <w14:schemeClr w14:val="tx1"/>
+            </w14:solidFill>
+          </w14:textFill>
+        </w:rPr>
+      </w:pPr>
+      <w:r>
+        <w:rPr>
+          <w:rFonts w:hint="eastAsia"/>
+          <w:color w:val="000000" w:themeColor="text1"/>
+          <w:sz w:val="48"/>
+          <w:szCs w:val="48"/>
+          <w:lang w:val="en-US" w:eastAsia="zh-CN"/>
+          <w14:textFill>
+            <w14:solidFill>
+              <w14:schemeClr w14:val="tx1"/>
+            </w14:solidFill>
+          </w14:textFill>
+        </w:rPr>
+        <w:t>存入10400HKD，买9股A博时港元（HK.03152）花费10196，可以使用返100HKD的优惠券。买入100HKD的货币基金（基金买入卖出0手续费）。剩余100HKD左右的现金存款，持有过夜即可。</w:t>
+      </w:r>
+    </w:p>
+    <w:p>
+      <w:pPr>
+        <w:rPr>
+          <w:rFonts w:hint="default"/>
+          <w:sz w:val="48"/>
+          <w:szCs w:val="48"/>
+          <w:lang w:val="en-US" w:eastAsia="zh-CN"/>
+        </w:rPr>
+      </w:pPr>
+    </w:p>
+    <w:p>
+      <w:pPr>
+        <w:rPr>
+          <w:rFonts w:hint="eastAsia"/>
+          <w:sz w:val="48"/>
+          <w:szCs w:val="48"/>
+          <w:lang w:val="en-US" w:eastAsia="zh-CN"/>
+        </w:rPr>
+      </w:pPr>
+    </w:p>
+    <w:p>
+      <w:pPr>
+        <w:rPr>
+          <w:rFonts w:hint="eastAsia"/>
+          <w:sz w:val="48"/>
+          <w:szCs w:val="48"/>
+          <w:lang w:val="en-US" w:eastAsia="zh-CN"/>
+        </w:rPr>
+      </w:pPr>
+      <w:r>
+        <w:rPr>
+          <w:rFonts w:hint="eastAsia"/>
+          <w:sz w:val="48"/>
+          <w:szCs w:val="48"/>
+          <w:lang w:val="en-US" w:eastAsia="zh-CN"/>
+        </w:rPr>
+        <w:t>平安数字银行</w:t>
+      </w:r>
+    </w:p>
+    <w:p>
+      <w:pPr>
+        <w:rPr>
+          <w:rFonts w:hint="eastAsia"/>
+          <w:sz w:val="48"/>
+          <w:szCs w:val="48"/>
+          <w:lang w:val="en-US" w:eastAsia="zh-CN"/>
+        </w:rPr>
+      </w:pPr>
+    </w:p>
+    <w:p>
+      <w:pPr>
+        <w:rPr>
+          <w:rFonts w:hint="eastAsia"/>
+          <w:sz w:val="48"/>
+          <w:szCs w:val="48"/>
+          <w:lang w:val="en-US" w:eastAsia="zh-CN"/>
+        </w:rPr>
+      </w:pPr>
+      <w:r>
+        <w:rPr>
+          <w:rFonts w:hint="eastAsia"/>
+          <w:sz w:val="48"/>
+          <w:szCs w:val="48"/>
+          <w:lang w:val="en-US" w:eastAsia="zh-CN"/>
+        </w:rPr>
+        <w:t>无门槛，通过邀请码开户我返200HKD</w:t>
+      </w:r>
+    </w:p>
+    <w:p>
+      <w:pPr>
+        <w:rPr>
+          <w:rFonts w:hint="eastAsia"/>
+          <w:sz w:val="48"/>
+          <w:szCs w:val="48"/>
+          <w:lang w:val="en-US" w:eastAsia="zh-CN"/>
+        </w:rPr>
+      </w:pPr>
+      <w:r>
+        <w:rPr>
+          <w:rFonts w:hint="eastAsia"/>
+          <w:sz w:val="48"/>
+          <w:szCs w:val="48"/>
+          <w:lang w:val="en-US" w:eastAsia="zh-CN"/>
+        </w:rPr>
+        <w:t>开通股票交易可使用港币200x2+100x12卷</w:t>
+      </w:r>
+    </w:p>
+    <w:p>
+      <w:pPr>
+        <w:rPr>
+          <w:rFonts w:hint="default"/>
+          <w:sz w:val="48"/>
+          <w:szCs w:val="48"/>
+          <w:lang w:val="en-US" w:eastAsia="zh-CN"/>
+        </w:rPr>
+      </w:pPr>
+      <w:r>
+        <w:rPr>
+          <w:rFonts w:hint="eastAsia"/>
+          <w:sz w:val="48"/>
+          <w:szCs w:val="48"/>
+          <w:lang w:val="en-US" w:eastAsia="zh-CN"/>
+        </w:rPr>
+        <w:t>这个银行一共能纯赚一千港币左右</w:t>
+      </w:r>
+    </w:p>
+    <w:p>
+      <w:pPr>
+        <w:rPr>
+          <w:rFonts w:hint="default"/>
+          <w:sz w:val="48"/>
+          <w:szCs w:val="48"/>
+          <w:lang w:val="en-US" w:eastAsia="zh-CN"/>
+        </w:rPr>
+      </w:pPr>
+    </w:p>
+    <w:p>
+      <w:pPr>
+        <w:rPr>
+          <w:rFonts w:hint="eastAsia"/>
+          <w:sz w:val="48"/>
+          <w:szCs w:val="48"/>
+          <w:lang w:val="en-US" w:eastAsia="zh-CN"/>
+        </w:rPr>
+      </w:pPr>
+      <w:r>
+        <w:rPr>
+          <w:rFonts w:hint="eastAsia"/>
+          <w:sz w:val="48"/>
+          <w:szCs w:val="48"/>
+          <w:lang w:val="en-US" w:eastAsia="zh-CN"/>
+        </w:rPr>
+        <w:t>邀请码M4HIX6</w:t>
+      </w:r>
+    </w:p>
+    <w:p>
+      <w:pPr>
+        <w:rPr>
+          <w:rFonts w:hint="eastAsia"/>
+          <w:sz w:val="48"/>
+          <w:szCs w:val="48"/>
+          <w:lang w:val="en-US" w:eastAsia="zh-CN"/>
+        </w:rPr>
+      </w:pPr>
+    </w:p>
+    <w:p>
+      <w:pPr>
+        <w:rPr>
+          <w:rFonts w:hint="eastAsia"/>
+          <w:sz w:val="48"/>
+          <w:szCs w:val="48"/>
+          <w:lang w:val="en-US" w:eastAsia="zh-CN"/>
+        </w:rPr>
+      </w:pPr>
+    </w:p>
+    <w:p>
+      <w:pPr>
+        <w:rPr>
+          <w:rFonts w:hint="eastAsia"/>
+          <w:sz w:val="48"/>
+          <w:szCs w:val="48"/>
+          <w:lang w:val="en-US" w:eastAsia="zh-CN"/>
+        </w:rPr>
+      </w:pPr>
+    </w:p>
+    <w:p>
+      <w:pPr>
+        <w:rPr>
+          <w:rFonts w:hint="eastAsia"/>
+          <w:sz w:val="48"/>
+          <w:szCs w:val="48"/>
+          <w:lang w:val="en-US" w:eastAsia="zh-CN"/>
+        </w:rPr>
+      </w:pPr>
+    </w:p>
+    <w:p>
+      <w:pPr>
+        <w:rPr>
+          <w:rFonts w:hint="eastAsia"/>
+          <w:sz w:val="48"/>
+          <w:szCs w:val="48"/>
+          <w:lang w:val="en-US" w:eastAsia="zh-CN"/>
+        </w:rPr>
+      </w:pPr>
+      <w:r>
+        <w:rPr>
+          <w:rFonts w:hint="eastAsia"/>
+          <w:sz w:val="48"/>
+          <w:szCs w:val="48"/>
+          <w:highlight w:val="yellow"/>
+          <w:lang w:val="en-US" w:eastAsia="zh-CN"/>
+        </w:rPr>
+        <w:t>另外传统实体大银行推荐开香港汇丰银行</w:t>
+      </w:r>
+      <w:r>
+        <w:rPr>
+          <w:rFonts w:hint="eastAsia"/>
+          <w:sz w:val="48"/>
+          <w:szCs w:val="48"/>
+          <w:lang w:val="en-US" w:eastAsia="zh-CN"/>
+        </w:rPr>
+        <w:t>，跟各个券商和银行出入金都很方便。</w:t>
+      </w:r>
+    </w:p>
+    <w:p>
+      <w:pPr>
+        <w:rPr>
+          <w:rFonts w:hint="eastAsia"/>
+          <w:sz w:val="48"/>
+          <w:szCs w:val="48"/>
+          <w:lang w:val="en-US" w:eastAsia="zh-CN"/>
+        </w:rPr>
+      </w:pPr>
+      <w:r>
+        <w:rPr>
+          <w:rFonts w:hint="eastAsia"/>
+          <w:sz w:val="48"/>
+          <w:szCs w:val="48"/>
+          <w:lang w:val="en-US" w:eastAsia="zh-CN"/>
+        </w:rPr>
+        <w:t>以上所有银行、券商均需要在香港本地通过手机线上申请开户。</w:t>
+      </w:r>
+    </w:p>
+    <w:p>
+      <w:pPr>
+        <w:rPr>
+          <w:rFonts w:hint="default"/>
+          <w:sz w:val="48"/>
+          <w:szCs w:val="48"/>
+          <w:highlight w:val="yellow"/>
+          <w:lang w:val="en-US" w:eastAsia="zh-CN"/>
+        </w:rPr>
+      </w:pPr>
+      <w:r>
+        <w:rPr>
+          <w:rFonts w:hint="eastAsia"/>
+          <w:sz w:val="48"/>
+          <w:szCs w:val="48"/>
+          <w:lang w:val="en-US" w:eastAsia="zh-CN"/>
+        </w:rPr>
+        <w:t>以上软件均可以在苹果商店/谷歌商店或对应官网下载，建议去之前先下载好。</w:t>
+      </w:r>
+      <w:r>
+        <w:rPr>
+          <w:rFonts w:hint="eastAsia"/>
+          <w:sz w:val="48"/>
+          <w:szCs w:val="48"/>
+          <w:highlight w:val="yellow"/>
+          <w:lang w:val="en-US" w:eastAsia="zh-CN"/>
+        </w:rPr>
+        <w:t>所有证件有效期均需要大于一年！</w:t>
+      </w:r>
+    </w:p>
+    <w:p>
+      <w:pPr>
+        <w:rPr>
+          <w:rFonts w:hint="eastAsia"/>
+          <w:sz w:val="48"/>
+          <w:szCs w:val="48"/>
+          <w:lang w:val="en-US" w:eastAsia="zh-CN"/>
+        </w:rPr>
+      </w:pPr>
+    </w:p>
+    <w:p>
+      <w:pPr>
+        <w:rPr>
+          <w:rFonts w:hint="eastAsia"/>
+          <w:sz w:val="30"/>
+          <w:szCs w:val="30"/>
+          <w:lang w:val="en-US" w:eastAsia="zh-CN"/>
+        </w:rPr>
+      </w:pPr>
+      <w:r>
+        <w:rPr>
+          <w:rFonts w:hint="eastAsia"/>
+          <w:sz w:val="30"/>
+          <w:szCs w:val="30"/>
+          <w:lang w:val="en-US" w:eastAsia="zh-CN"/>
+        </w:rPr>
+        <w:t>*苹果商店/谷歌商店需要注意账号区域，建议港区号下载</w:t>
+      </w:r>
+    </w:p>
+    <w:p>
+      <w:pPr>
+        <w:rPr>
+          <w:rFonts w:hint="eastAsia"/>
+          <w:sz w:val="48"/>
+          <w:szCs w:val="48"/>
+          <w:lang w:val="en-US" w:eastAsia="zh-CN"/>
+        </w:rPr>
+      </w:pPr>
+    </w:p>
+    <w:p>
+      <w:pPr>
+        <w:rPr>
+          <w:rFonts w:hint="eastAsia"/>
+          <w:sz w:val="48"/>
+          <w:szCs w:val="48"/>
+          <w:lang w:val="en-US" w:eastAsia="zh-CN"/>
+        </w:rPr>
+      </w:pPr>
+      <w:r>
+        <w:rPr>
+          <w:rFonts w:hint="eastAsia"/>
+          <w:sz w:val="48"/>
+          <w:szCs w:val="48"/>
+          <w:lang w:val="en-US" w:eastAsia="zh-CN"/>
+        </w:rPr>
+        <w:t xml:space="preserve">我的联系方式 </w:t>
+      </w:r>
+    </w:p>
+    <w:p>
+      <w:pPr>
+        <w:rPr>
+          <w:rFonts w:hint="eastAsia"/>
+          <w:sz w:val="48"/>
+          <w:szCs w:val="48"/>
+          <w:lang w:val="en-US" w:eastAsia="zh-CN"/>
+        </w:rPr>
+      </w:pPr>
+    </w:p>
+    <w:p>
+      <w:pPr>
+        <w:rPr>
+          <w:rFonts w:hint="default"/>
+          <w:sz w:val="48"/>
+          <w:szCs w:val="48"/>
+          <w:lang w:val="en-US" w:eastAsia="zh-CN"/>
+        </w:rPr>
+      </w:pPr>
+      <w:r>
+        <w:rPr>
+          <w:rFonts w:hint="eastAsia"/>
+          <w:sz w:val="48"/>
+          <w:szCs w:val="48"/>
+          <w:lang w:val="en-US" w:eastAsia="zh-CN"/>
+        </w:rPr>
+        <w:t>微信：KirinChew</w:t>
+      </w:r>
+    </w:p>
+    <w:p>
+      <w:pPr>
+        <w:rPr>
+          <w:rFonts w:hint="eastAsia"/>
+          <w:sz w:val="48"/>
+          <w:szCs w:val="48"/>
+          <w:lang w:val="en-US" w:eastAsia="zh-CN"/>
+        </w:rPr>
+      </w:pPr>
+    </w:p>
+    <w:p>
+      <w:pPr>
+        <w:rPr>
+          <w:rFonts w:hint="eastAsia"/>
+          <w:sz w:val="48"/>
+          <w:szCs w:val="48"/>
+          <w:lang w:val="en-US" w:eastAsia="zh-CN"/>
+        </w:rPr>
+      </w:pPr>
+      <w:r>
+        <w:rPr>
+          <w:rFonts w:hint="eastAsia"/>
+          <w:sz w:val="48"/>
+          <w:szCs w:val="48"/>
+          <w:lang w:val="en-US" w:eastAsia="zh-CN"/>
+        </w:rPr>
+        <w:t>TG：</w:t>
+      </w:r>
+      <w:r>
+        <w:rPr>
+          <w:rFonts w:hint="eastAsia"/>
+          <w:sz w:val="48"/>
+          <w:szCs w:val="48"/>
+          <w:lang w:val="en-US" w:eastAsia="zh-CN"/>
+        </w:rPr>
+        <w:fldChar w:fldCharType="begin"/>
+      </w:r>
+      <w:r>
+        <w:rPr>
+          <w:rFonts w:hint="eastAsia"/>
+          <w:sz w:val="48"/>
+          <w:szCs w:val="48"/>
+          <w:lang w:val="en-US" w:eastAsia="zh-CN"/>
+        </w:rPr>
+        <w:instrText xml:space="preserve"> HYPERLINK "https://t.me/KirinChew" </w:instrText>
+      </w:r>
+      <w:r>
+        <w:rPr>
+          <w:rFonts w:hint="eastAsia"/>
+          <w:sz w:val="48"/>
+          <w:szCs w:val="48"/>
+          <w:lang w:val="en-US" w:eastAsia="zh-CN"/>
+        </w:rPr>
+        <w:fldChar w:fldCharType="separate"/>
+      </w:r>
+      <w:r>
+        <w:rPr>
+          <w:rStyle w:val="11"/>
+          <w:rFonts w:hint="eastAsia"/>
+          <w:sz w:val="48"/>
+          <w:szCs w:val="48"/>
+          <w:lang w:val="en-US" w:eastAsia="zh-CN"/>
+        </w:rPr>
+        <w:t>https://t.me/KirinChew</w:t>
+      </w:r>
+      <w:r>
+        <w:rPr>
+          <w:rFonts w:hint="eastAsia"/>
+          <w:sz w:val="48"/>
+          <w:szCs w:val="48"/>
+          <w:lang w:val="en-US" w:eastAsia="zh-CN"/>
+        </w:rPr>
+        <w:fldChar w:fldCharType="end"/>
+      </w:r>
+    </w:p>
+    <w:p>
+      <w:pPr>
+        <w:rPr>
+          <w:rFonts w:hint="eastAsia"/>
+          <w:sz w:val="48"/>
+          <w:szCs w:val="48"/>
+          <w:lang w:val="en-US" w:eastAsia="zh-CN"/>
+        </w:rPr>
+      </w:pPr>
+    </w:p>
+    <w:p>
+      <w:pPr>
+        <w:rPr>
+          <w:rFonts w:hint="default"/>
+          <w:sz w:val="48"/>
+          <w:szCs w:val="48"/>
+          <w:lang w:val="en-US" w:eastAsia="zh-CN"/>
+        </w:rPr>
+      </w:pPr>
+    </w:p>
+    <w:p>
+      <w:pPr>
+        <w:rPr>
+          <w:rFonts w:hint="default"/>
           <w:sz w:val="24"/>
           <w:szCs w:val="24"/>
           <w:lang w:val="en-US" w:eastAsia="zh-CN"/>
@@ -2563,468 +3590,6 @@
           <w:szCs w:val="24"/>
           <w:lang w:val="en-US" w:eastAsia="zh-CN"/>
         </w:rPr>
-        <w:t>具体奖励：</w:t>
-      </w:r>
-      <w:r>
-        <w:rPr>
-          <w:rFonts w:hint="eastAsia"/>
-          <w:sz w:val="24"/>
-          <w:szCs w:val="24"/>
-          <w:lang w:val="en-US" w:eastAsia="zh-CN"/>
-        </w:rPr>
-        <w:fldChar w:fldCharType="begin"/>
-      </w:r>
-      <w:r>
-        <w:rPr>
-          <w:rFonts w:hint="eastAsia"/>
-          <w:sz w:val="24"/>
-          <w:szCs w:val="24"/>
-          <w:lang w:val="en-US" w:eastAsia="zh-CN"/>
-        </w:rPr>
-        <w:instrText xml:space="preserve"> HYPERLINK "https://l.za.group/qFE47" </w:instrText>
-      </w:r>
-      <w:r>
-        <w:rPr>
-          <w:rFonts w:hint="eastAsia"/>
-          <w:sz w:val="24"/>
-          <w:szCs w:val="24"/>
-          <w:lang w:val="en-US" w:eastAsia="zh-CN"/>
-        </w:rPr>
-        <w:fldChar w:fldCharType="separate"/>
-      </w:r>
-      <w:r>
-        <w:rPr>
-          <w:rStyle w:val="11"/>
-          <w:rFonts w:hint="eastAsia"/>
-          <w:sz w:val="24"/>
-          <w:szCs w:val="24"/>
-          <w:lang w:val="en-US" w:eastAsia="zh-CN"/>
-        </w:rPr>
-        <w:t>https://l.za.group/qFE47</w:t>
-      </w:r>
-      <w:r>
-        <w:rPr>
-          <w:rFonts w:hint="eastAsia"/>
-          <w:sz w:val="24"/>
-          <w:szCs w:val="24"/>
-          <w:lang w:val="en-US" w:eastAsia="zh-CN"/>
-        </w:rPr>
-        <w:fldChar w:fldCharType="end"/>
-      </w:r>
-    </w:p>
-    <w:p>
-      <w:pPr>
-        <w:rPr>
-          <w:rFonts w:hint="eastAsia"/>
-          <w:sz w:val="48"/>
-          <w:szCs w:val="48"/>
-          <w:lang w:val="en-US" w:eastAsia="zh-CN"/>
-        </w:rPr>
-      </w:pPr>
-    </w:p>
-    <w:p>
-      <w:pPr>
-        <w:rPr>
-          <w:rFonts w:hint="eastAsia"/>
-          <w:sz w:val="48"/>
-          <w:szCs w:val="48"/>
-          <w:lang w:val="en-US" w:eastAsia="zh-CN"/>
-        </w:rPr>
-      </w:pPr>
-      <w:r>
-        <w:rPr>
-          <w:rFonts w:hint="eastAsia"/>
-          <w:sz w:val="48"/>
-          <w:szCs w:val="48"/>
-          <w:lang w:val="en-US" w:eastAsia="zh-CN"/>
-        </w:rPr>
-        <w:t>邀请码LN7258</w:t>
-      </w:r>
-    </w:p>
-    <w:p>
-      <w:pPr>
-        <w:rPr>
-          <w:rFonts w:hint="default"/>
-          <w:sz w:val="48"/>
-          <w:szCs w:val="48"/>
-          <w:lang w:val="en-US" w:eastAsia="zh-CN"/>
-        </w:rPr>
-      </w:pPr>
-    </w:p>
-    <w:p>
-      <w:pPr>
-        <w:rPr>
-          <w:rFonts w:hint="default"/>
-          <w:sz w:val="48"/>
-          <w:szCs w:val="48"/>
-          <w:lang w:val="en-US" w:eastAsia="zh-CN"/>
-        </w:rPr>
-      </w:pPr>
-    </w:p>
-    <w:p>
-      <w:pPr>
-        <w:rPr>
-          <w:rFonts w:hint="eastAsia"/>
-          <w:sz w:val="48"/>
-          <w:szCs w:val="48"/>
-          <w:lang w:val="en-US" w:eastAsia="zh-CN"/>
-        </w:rPr>
-      </w:pPr>
-    </w:p>
-    <w:p>
-      <w:pPr>
-        <w:rPr>
-          <w:rFonts w:hint="eastAsia"/>
-          <w:sz w:val="48"/>
-          <w:szCs w:val="48"/>
-          <w:lang w:val="en-US" w:eastAsia="zh-CN"/>
-        </w:rPr>
-      </w:pPr>
-    </w:p>
-    <w:p>
-      <w:pPr>
-        <w:rPr>
-          <w:rFonts w:hint="eastAsia"/>
-          <w:sz w:val="48"/>
-          <w:szCs w:val="48"/>
-          <w:lang w:val="en-US" w:eastAsia="zh-CN"/>
-        </w:rPr>
-      </w:pPr>
-    </w:p>
-    <w:p>
-      <w:pPr>
-        <w:rPr>
-          <w:rFonts w:hint="eastAsia"/>
-          <w:sz w:val="48"/>
-          <w:szCs w:val="48"/>
-          <w:lang w:val="en-US" w:eastAsia="zh-CN"/>
-        </w:rPr>
-      </w:pPr>
-    </w:p>
-    <w:p>
-      <w:pPr>
-        <w:rPr>
-          <w:rFonts w:hint="eastAsia"/>
-          <w:sz w:val="48"/>
-          <w:szCs w:val="48"/>
-          <w:lang w:val="en-US" w:eastAsia="zh-CN"/>
-        </w:rPr>
-      </w:pPr>
-    </w:p>
-    <w:p>
-      <w:pPr>
-        <w:rPr>
-          <w:rFonts w:hint="eastAsia"/>
-          <w:sz w:val="48"/>
-          <w:szCs w:val="48"/>
-          <w:lang w:val="en-US" w:eastAsia="zh-CN"/>
-        </w:rPr>
-      </w:pPr>
-    </w:p>
-    <w:p>
-      <w:pPr>
-        <w:rPr>
-          <w:rFonts w:hint="eastAsia"/>
-          <w:sz w:val="48"/>
-          <w:szCs w:val="48"/>
-          <w:lang w:val="en-US" w:eastAsia="zh-CN"/>
-        </w:rPr>
-      </w:pPr>
-    </w:p>
-    <w:p>
-      <w:pPr>
-        <w:rPr>
-          <w:rFonts w:hint="eastAsia"/>
-          <w:sz w:val="48"/>
-          <w:szCs w:val="48"/>
-          <w:lang w:val="en-US" w:eastAsia="zh-CN"/>
-        </w:rPr>
-      </w:pPr>
-    </w:p>
-    <w:p>
-      <w:pPr>
-        <w:rPr>
-          <w:rFonts w:hint="eastAsia"/>
-          <w:sz w:val="48"/>
-          <w:szCs w:val="48"/>
-          <w:lang w:val="en-US" w:eastAsia="zh-CN"/>
-        </w:rPr>
-      </w:pPr>
-    </w:p>
-    <w:p>
-      <w:pPr>
-        <w:rPr>
-          <w:rFonts w:hint="eastAsia"/>
-          <w:sz w:val="48"/>
-          <w:szCs w:val="48"/>
-          <w:lang w:val="en-US" w:eastAsia="zh-CN"/>
-        </w:rPr>
-      </w:pPr>
-      <w:r>
-        <w:rPr>
-          <w:rFonts w:hint="eastAsia"/>
-          <w:sz w:val="48"/>
-          <w:szCs w:val="48"/>
-          <w:lang w:val="en-US" w:eastAsia="zh-CN"/>
-        </w:rPr>
-        <w:t>平安数字银行</w:t>
-      </w:r>
-    </w:p>
-    <w:p>
-      <w:pPr>
-        <w:rPr>
-          <w:rFonts w:hint="eastAsia"/>
-          <w:sz w:val="48"/>
-          <w:szCs w:val="48"/>
-          <w:lang w:val="en-US" w:eastAsia="zh-CN"/>
-        </w:rPr>
-      </w:pPr>
-    </w:p>
-    <w:p>
-      <w:pPr>
-        <w:rPr>
-          <w:rFonts w:hint="eastAsia"/>
-          <w:sz w:val="48"/>
-          <w:szCs w:val="48"/>
-          <w:lang w:val="en-US" w:eastAsia="zh-CN"/>
-        </w:rPr>
-      </w:pPr>
-      <w:r>
-        <w:rPr>
-          <w:rFonts w:hint="eastAsia"/>
-          <w:sz w:val="48"/>
-          <w:szCs w:val="48"/>
-          <w:lang w:val="en-US" w:eastAsia="zh-CN"/>
-        </w:rPr>
-        <w:t>无门槛，通过邀请码开户我返200HKD</w:t>
-      </w:r>
-    </w:p>
-    <w:p>
-      <w:pPr>
-        <w:rPr>
-          <w:rFonts w:hint="eastAsia"/>
-          <w:sz w:val="48"/>
-          <w:szCs w:val="48"/>
-          <w:lang w:val="en-US" w:eastAsia="zh-CN"/>
-        </w:rPr>
-      </w:pPr>
-      <w:r>
-        <w:rPr>
-          <w:rFonts w:hint="eastAsia"/>
-          <w:sz w:val="48"/>
-          <w:szCs w:val="48"/>
-          <w:lang w:val="en-US" w:eastAsia="zh-CN"/>
-        </w:rPr>
-        <w:t>开通股票交易可使用港币200x2+100x12卷</w:t>
-      </w:r>
-    </w:p>
-    <w:p>
-      <w:pPr>
-        <w:rPr>
-          <w:rFonts w:hint="default"/>
-          <w:sz w:val="48"/>
-          <w:szCs w:val="48"/>
-          <w:lang w:val="en-US" w:eastAsia="zh-CN"/>
-        </w:rPr>
-      </w:pPr>
-      <w:r>
-        <w:rPr>
-          <w:rFonts w:hint="eastAsia"/>
-          <w:sz w:val="48"/>
-          <w:szCs w:val="48"/>
-          <w:lang w:val="en-US" w:eastAsia="zh-CN"/>
-        </w:rPr>
-        <w:t>这个银行一共能纯赚一千港币左右</w:t>
-      </w:r>
-    </w:p>
-    <w:p>
-      <w:pPr>
-        <w:rPr>
-          <w:rFonts w:hint="default"/>
-          <w:sz w:val="48"/>
-          <w:szCs w:val="48"/>
-          <w:lang w:val="en-US" w:eastAsia="zh-CN"/>
-        </w:rPr>
-      </w:pPr>
-    </w:p>
-    <w:p>
-      <w:pPr>
-        <w:rPr>
-          <w:rFonts w:hint="eastAsia"/>
-          <w:sz w:val="48"/>
-          <w:szCs w:val="48"/>
-          <w:lang w:val="en-US" w:eastAsia="zh-CN"/>
-        </w:rPr>
-      </w:pPr>
-      <w:r>
-        <w:rPr>
-          <w:rFonts w:hint="eastAsia"/>
-          <w:sz w:val="48"/>
-          <w:szCs w:val="48"/>
-          <w:lang w:val="en-US" w:eastAsia="zh-CN"/>
-        </w:rPr>
-        <w:t>邀请码M4HIX6</w:t>
-      </w:r>
-    </w:p>
-    <w:p>
-      <w:pPr>
-        <w:rPr>
-          <w:rFonts w:hint="eastAsia"/>
-          <w:sz w:val="48"/>
-          <w:szCs w:val="48"/>
-          <w:lang w:val="en-US" w:eastAsia="zh-CN"/>
-        </w:rPr>
-      </w:pPr>
-    </w:p>
-    <w:p>
-      <w:pPr>
-        <w:rPr>
-          <w:rFonts w:hint="eastAsia"/>
-          <w:sz w:val="48"/>
-          <w:szCs w:val="48"/>
-          <w:lang w:val="en-US" w:eastAsia="zh-CN"/>
-        </w:rPr>
-      </w:pPr>
-    </w:p>
-    <w:p>
-      <w:pPr>
-        <w:rPr>
-          <w:rFonts w:hint="eastAsia"/>
-          <w:sz w:val="48"/>
-          <w:szCs w:val="48"/>
-          <w:lang w:val="en-US" w:eastAsia="zh-CN"/>
-        </w:rPr>
-      </w:pPr>
-      <w:r>
-        <w:rPr>
-          <w:rFonts w:hint="eastAsia"/>
-          <w:sz w:val="48"/>
-          <w:szCs w:val="48"/>
-          <w:lang w:val="en-US" w:eastAsia="zh-CN"/>
-        </w:rPr>
-        <w:t xml:space="preserve">我的联系方式 </w:t>
-      </w:r>
-    </w:p>
-    <w:p>
-      <w:pPr>
-        <w:rPr>
-          <w:rFonts w:hint="eastAsia"/>
-          <w:sz w:val="48"/>
-          <w:szCs w:val="48"/>
-          <w:lang w:val="en-US" w:eastAsia="zh-CN"/>
-        </w:rPr>
-      </w:pPr>
-      <w:r>
-        <w:rPr>
-          <w:rFonts w:hint="eastAsia"/>
-          <w:sz w:val="48"/>
-          <w:szCs w:val="48"/>
-          <w:lang w:val="en-US" w:eastAsia="zh-CN"/>
-        </w:rPr>
-        <w:t>TG：</w:t>
-      </w:r>
-      <w:r>
-        <w:rPr>
-          <w:rFonts w:hint="eastAsia"/>
-          <w:sz w:val="48"/>
-          <w:szCs w:val="48"/>
-          <w:lang w:val="en-US" w:eastAsia="zh-CN"/>
-        </w:rPr>
-        <w:fldChar w:fldCharType="begin"/>
-      </w:r>
-      <w:r>
-        <w:rPr>
-          <w:rFonts w:hint="eastAsia"/>
-          <w:sz w:val="48"/>
-          <w:szCs w:val="48"/>
-          <w:lang w:val="en-US" w:eastAsia="zh-CN"/>
-        </w:rPr>
-        <w:instrText xml:space="preserve"> HYPERLINK "https://t.me/KirinChew" </w:instrText>
-      </w:r>
-      <w:r>
-        <w:rPr>
-          <w:rFonts w:hint="eastAsia"/>
-          <w:sz w:val="48"/>
-          <w:szCs w:val="48"/>
-          <w:lang w:val="en-US" w:eastAsia="zh-CN"/>
-        </w:rPr>
-        <w:fldChar w:fldCharType="separate"/>
-      </w:r>
-      <w:r>
-        <w:rPr>
-          <w:rStyle w:val="11"/>
-          <w:rFonts w:hint="eastAsia"/>
-          <w:sz w:val="48"/>
-          <w:szCs w:val="48"/>
-          <w:lang w:val="en-US" w:eastAsia="zh-CN"/>
-        </w:rPr>
-        <w:t>https://t.me/KirinChew</w:t>
-      </w:r>
-      <w:r>
-        <w:rPr>
-          <w:rFonts w:hint="eastAsia"/>
-          <w:sz w:val="48"/>
-          <w:szCs w:val="48"/>
-          <w:lang w:val="en-US" w:eastAsia="zh-CN"/>
-        </w:rPr>
-        <w:fldChar w:fldCharType="end"/>
-      </w:r>
-    </w:p>
-    <w:p>
-      <w:pPr>
-        <w:rPr>
-          <w:rFonts w:hint="eastAsia"/>
-          <w:sz w:val="48"/>
-          <w:szCs w:val="48"/>
-          <w:lang w:val="en-US" w:eastAsia="zh-CN"/>
-        </w:rPr>
-      </w:pPr>
-    </w:p>
-    <w:p>
-      <w:pPr>
-        <w:rPr>
-          <w:rFonts w:hint="default"/>
-          <w:sz w:val="48"/>
-          <w:szCs w:val="48"/>
-          <w:lang w:val="en-US" w:eastAsia="zh-CN"/>
-        </w:rPr>
-      </w:pPr>
-      <w:r>
-        <w:rPr>
-          <w:rFonts w:hint="eastAsia"/>
-          <w:sz w:val="48"/>
-          <w:szCs w:val="48"/>
-          <w:lang w:val="en-US" w:eastAsia="zh-CN"/>
-        </w:rPr>
-        <w:t>微信：KirinChew</w:t>
-      </w:r>
-    </w:p>
-    <w:p>
-      <w:pPr>
-        <w:rPr>
-          <w:rFonts w:hint="default"/>
-          <w:sz w:val="48"/>
-          <w:szCs w:val="48"/>
-          <w:lang w:val="en-US" w:eastAsia="zh-CN"/>
-        </w:rPr>
-      </w:pPr>
-    </w:p>
-    <w:p>
-      <w:pPr>
-        <w:rPr>
-          <w:rFonts w:hint="default"/>
-          <w:sz w:val="24"/>
-          <w:szCs w:val="24"/>
-          <w:lang w:val="en-US" w:eastAsia="zh-CN"/>
-        </w:rPr>
-      </w:pPr>
-      <w:r>
-        <w:rPr>
-          <w:rFonts w:hint="eastAsia"/>
-          <w:sz w:val="24"/>
-          <w:szCs w:val="24"/>
-          <w:lang w:val="en-US" w:eastAsia="zh-CN"/>
-        </w:rPr>
         <w:t>需要香港电话卡接短信/用流量的也可以联系我（CSL和hahasim）保号低至20HKD/year</w:t>
       </w:r>
     </w:p>
@@ -3034,115 +3599,128 @@
           <w:rFonts w:hint="eastAsia"/>
           <w:sz w:val="48"/>
           <w:szCs w:val="48"/>
-          <w:lang w:val="en-US" w:eastAsia="zh-CN"/>
-        </w:rPr>
-      </w:pPr>
-    </w:p>
-    <w:p>
-      <w:pPr>
-        <w:rPr>
-          <w:rFonts w:hint="eastAsia"/>
-          <w:sz w:val="48"/>
-          <w:szCs w:val="48"/>
-          <w:lang w:val="en-US" w:eastAsia="zh-CN"/>
-        </w:rPr>
-      </w:pPr>
-      <w:r>
-        <w:rPr>
-          <w:rFonts w:hint="eastAsia"/>
-          <w:sz w:val="48"/>
-          <w:szCs w:val="48"/>
           <w:highlight w:val="yellow"/>
           <w:lang w:val="en-US" w:eastAsia="zh-CN"/>
         </w:rPr>
-        <w:t>另外传统实体大银行推荐开香港汇丰银行</w:t>
-      </w:r>
-      <w:r>
-        <w:rPr>
-          <w:rFonts w:hint="eastAsia"/>
-          <w:sz w:val="48"/>
-          <w:szCs w:val="48"/>
-          <w:lang w:val="en-US" w:eastAsia="zh-CN"/>
-        </w:rPr>
-        <w:t>，跟各个券商和银行出入金都很方便。</w:t>
-      </w:r>
-    </w:p>
-    <w:p>
-      <w:pPr>
-        <w:rPr>
-          <w:rFonts w:hint="eastAsia"/>
-          <w:sz w:val="48"/>
-          <w:szCs w:val="48"/>
-          <w:lang w:val="en-US" w:eastAsia="zh-CN"/>
-        </w:rPr>
-      </w:pPr>
-      <w:r>
-        <w:rPr>
-          <w:rFonts w:hint="eastAsia"/>
-          <w:sz w:val="48"/>
-          <w:szCs w:val="48"/>
-          <w:lang w:val="en-US" w:eastAsia="zh-CN"/>
-        </w:rPr>
-        <w:t>以上所有银行、券商均需要在香港本地通过手机线上申请开户。</w:t>
-      </w:r>
-    </w:p>
-    <w:p>
-      <w:pPr>
-        <w:rPr>
-          <w:rFonts w:hint="default"/>
-          <w:sz w:val="48"/>
-          <w:szCs w:val="48"/>
-          <w:highlight w:val="yellow"/>
-          <w:lang w:val="en-US" w:eastAsia="zh-CN"/>
-        </w:rPr>
-      </w:pPr>
-      <w:r>
-        <w:rPr>
-          <w:rFonts w:hint="eastAsia"/>
-          <w:sz w:val="48"/>
-          <w:szCs w:val="48"/>
-          <w:lang w:val="en-US" w:eastAsia="zh-CN"/>
-        </w:rPr>
-        <w:t>以上软件均可以在苹果商店/谷歌商店或对应官网下载，建议去之前先下载好。</w:t>
-      </w:r>
-      <w:r>
-        <w:rPr>
-          <w:rFonts w:hint="eastAsia"/>
-          <w:sz w:val="48"/>
-          <w:szCs w:val="48"/>
-          <w:highlight w:val="yellow"/>
-          <w:lang w:val="en-US" w:eastAsia="zh-CN"/>
-        </w:rPr>
-        <w:t>所有证件有效期均需要大于一年！</w:t>
-      </w:r>
-    </w:p>
-    <w:p>
-      <w:pPr>
-        <w:rPr>
-          <w:rFonts w:hint="eastAsia"/>
-          <w:sz w:val="48"/>
-          <w:szCs w:val="48"/>
-          <w:lang w:val="en-US" w:eastAsia="zh-CN"/>
-        </w:rPr>
-      </w:pPr>
-    </w:p>
-    <w:p>
-      <w:pPr>
-        <w:rPr>
-          <w:rFonts w:hint="default"/>
+      </w:pPr>
+    </w:p>
+    <w:p>
+      <w:pPr>
+        <w:rPr>
+          <w:rFonts w:hint="eastAsia"/>
           <w:sz w:val="30"/>
           <w:szCs w:val="30"/>
           <w:lang w:val="en-US" w:eastAsia="zh-CN"/>
         </w:rPr>
       </w:pPr>
-      <w:r>
+    </w:p>
+    <w:p>
+      <w:pPr>
         <w:rPr>
           <w:rFonts w:hint="eastAsia"/>
           <w:sz w:val="30"/>
           <w:szCs w:val="30"/>
           <w:lang w:val="en-US" w:eastAsia="zh-CN"/>
         </w:rPr>
-        <w:t>*苹果商店/谷歌商店需要注意账号区域，建议港区号下载</w:t>
+      </w:pPr>
+    </w:p>
+    <w:p>
+      <w:pPr>
+        <w:rPr>
+          <w:rFonts w:hint="eastAsia"/>
+          <w:sz w:val="30"/>
+          <w:szCs w:val="30"/>
+          <w:lang w:val="en-US" w:eastAsia="zh-CN"/>
+        </w:rPr>
+      </w:pPr>
+    </w:p>
+    <w:p>
+      <w:pPr>
+        <w:rPr>
+          <w:rFonts w:hint="eastAsia"/>
+          <w:sz w:val="30"/>
+          <w:szCs w:val="30"/>
+          <w:lang w:val="en-US" w:eastAsia="zh-CN"/>
+        </w:rPr>
+      </w:pPr>
+    </w:p>
+    <w:p>
+      <w:pPr>
+        <w:rPr>
+          <w:rFonts w:hint="eastAsia"/>
+          <w:sz w:val="30"/>
+          <w:szCs w:val="30"/>
+          <w:lang w:val="en-US" w:eastAsia="zh-CN"/>
+        </w:rPr>
+      </w:pPr>
+    </w:p>
+    <w:p>
+      <w:pPr>
+        <w:rPr>
+          <w:rFonts w:hint="eastAsia"/>
+          <w:sz w:val="30"/>
+          <w:szCs w:val="30"/>
+          <w:lang w:val="en-US" w:eastAsia="zh-CN"/>
+        </w:rPr>
+      </w:pPr>
+    </w:p>
+    <w:p>
+      <w:pPr>
+        <w:rPr>
+          <w:rFonts w:hint="eastAsia"/>
+          <w:sz w:val="30"/>
+          <w:szCs w:val="30"/>
+          <w:lang w:val="en-US" w:eastAsia="zh-CN"/>
+        </w:rPr>
+      </w:pPr>
+    </w:p>
+    <w:p>
+      <w:pPr>
+        <w:rPr>
+          <w:rFonts w:hint="eastAsia"/>
+          <w:sz w:val="30"/>
+          <w:szCs w:val="30"/>
+          <w:lang w:val="en-US" w:eastAsia="zh-CN"/>
+        </w:rPr>
+      </w:pPr>
+    </w:p>
+    <w:p>
+      <w:pPr>
+        <w:rPr>
+          <w:rFonts w:hint="eastAsia"/>
+          <w:sz w:val="30"/>
+          <w:szCs w:val="30"/>
+          <w:lang w:val="en-US" w:eastAsia="zh-CN"/>
+        </w:rPr>
+      </w:pPr>
+    </w:p>
+    <w:p>
+      <w:pPr>
+        <w:rPr>
+          <w:rFonts w:hint="eastAsia"/>
+          <w:sz w:val="30"/>
+          <w:szCs w:val="30"/>
+          <w:lang w:val="en-US" w:eastAsia="zh-CN"/>
+        </w:rPr>
+      </w:pPr>
+    </w:p>
+    <w:p>
+      <w:pPr>
+        <w:rPr>
+          <w:rFonts w:hint="default"/>
+          <w:sz w:val="30"/>
+          <w:szCs w:val="30"/>
+          <w:lang w:val="en-US" w:eastAsia="zh-CN"/>
+        </w:rPr>
+      </w:pPr>
+      <w:r>
+        <w:rPr>
+          <w:rFonts w:hint="eastAsia"/>
+          <w:sz w:val="30"/>
+          <w:szCs w:val="30"/>
+          <w:lang w:val="en-US" w:eastAsia="zh-CN"/>
+        </w:rPr>
+        <w:t>文档更新日期2026.9月，每个月活动可能都会变，建议看网站或者联系咨询我！谢谢</w:t>
       </w:r>
     </w:p>
     <w:sectPr>

</xml_diff>